<commit_message>
Applicated Universal Exponential Equation 4.0 for Exponential Loss Energy with Zeta Percentation | (16:43 (W.I.B[Waktu Indonesia bagian Barat]), 03/04/2026), Batam, Kepulauan Riau, Indonesia | Applicated Universal Exponential Equation 4.0 for Exponential Loss Energy with Zeta Percentation #FREEISRAEL #LONGLIVEISRAEL #1ISRAEL #PROVERBS10VERSES4 #JOHN8VERSES21 #LUCAS8VERSES15
Applicated Universal Exponential Equation 4.0 for Exponential Loss Energy with Zeta Percentation | (16:43 (W.I.B[Waktu Indonesia bagian Barat]), 03/04/2026), Batam, Kepulauan Riau, Indonesia | Applicated Universal Exponential Equation 4.0 for Exponential Loss Energy with Zeta Percentation #FREEISRAEL #LONGLIVEISRAEL #1ISRAEL #PROVERBS10VERSES4 #JOHN8VERSES21 #LUCAS8VERSES15
</commit_message>
<xml_diff>
--- a/Applicated Universal Exponential Equation 4.0 for Exponential Loss Energy with Zeta Percentation.docx
+++ b/Applicated Universal Exponential Equation 4.0 for Exponential Loss Energy with Zeta Percentation.docx
@@ -3356,1264 +3356,1330 @@
     <w:p>
       <w:pPr>
         <w:spacing w:line="360" w:lineRule="auto"/>
-        <w:jc w:val="center"/>
         <w:rPr>
           <w:rFonts w:ascii="Times New Roman" w:hAnsi="Times New Roman" w:cs="Times New Roman"/>
           <w:sz w:val="24"/>
           <w:szCs w:val="24"/>
+          <w:lang w:val="id-ID"/>
         </w:rPr>
       </w:pPr>
-      <m:oMathPara>
-        <m:oMath>
-          <m:nary>
-            <m:naryPr>
-              <m:chr m:val="∑"/>
-              <m:limLoc m:val="undOvr"/>
-              <m:supHide m:val="1"/>
-              <m:ctrlPr>
-                <w:rPr>
-                  <w:rFonts w:ascii="Cambria Math" w:hAnsi="Cambria Math" w:cs="Times New Roman"/>
-                  <w:i/>
-                  <w:sz w:val="24"/>
-                  <w:szCs w:val="24"/>
-                </w:rPr>
-              </m:ctrlPr>
-            </m:naryPr>
-            <m:sub>
-              <m:d>
-                <m:dPr>
-                  <m:ctrlPr>
-                    <w:rPr>
-                      <w:rFonts w:ascii="Cambria Math" w:hAnsi="Cambria Math" w:cs="Times New Roman"/>
-                      <w:i/>
-                      <w:sz w:val="24"/>
-                      <w:szCs w:val="24"/>
-                    </w:rPr>
-                  </m:ctrlPr>
-                </m:dPr>
-                <m:e>
-                  <m:r>
-                    <w:rPr>
-                      <w:rFonts w:ascii="Cambria Math" w:hAnsi="Cambria Math" w:cs="Times New Roman"/>
-                      <w:sz w:val="24"/>
-                      <w:szCs w:val="24"/>
-                    </w:rPr>
-                    <m:t>ζ</m:t>
-                  </m:r>
-                  <m:d>
-                    <m:dPr>
-                      <m:begChr m:val="{"/>
-                      <m:endChr m:val="}"/>
-                      <m:ctrlPr>
-                        <w:rPr>
-                          <w:rFonts w:ascii="Cambria Math" w:hAnsi="Cambria Math" w:cs="Times New Roman"/>
-                          <w:i/>
-                          <w:sz w:val="24"/>
-                          <w:szCs w:val="24"/>
-                        </w:rPr>
-                      </m:ctrlPr>
-                    </m:dPr>
-                    <m:e>
-                      <m:r>
-                        <w:rPr>
-                          <w:rFonts w:ascii="Cambria Math" w:hAnsi="Cambria Math" w:cs="Times New Roman"/>
-                          <w:sz w:val="24"/>
-                          <w:szCs w:val="24"/>
-                        </w:rPr>
-                        <m:t>s</m:t>
-                      </m:r>
-                    </m:e>
-                  </m:d>
-                  <m:r>
-                    <w:rPr>
-                      <w:rFonts w:ascii="Cambria Math" w:hAnsi="Cambria Math" w:cs="Times New Roman"/>
-                      <w:sz w:val="24"/>
-                      <w:szCs w:val="24"/>
-                    </w:rPr>
-                    <m:t xml:space="preserve"> = </m:t>
-                  </m:r>
-                  <m:d>
-                    <m:dPr>
-                      <m:begChr m:val="{"/>
-                      <m:endChr m:val="}"/>
-                      <m:ctrlPr>
-                        <w:rPr>
-                          <w:rFonts w:ascii="Cambria Math" w:hAnsi="Cambria Math" w:cs="Times New Roman"/>
-                          <w:i/>
-                          <w:sz w:val="24"/>
-                          <w:szCs w:val="24"/>
-                        </w:rPr>
-                      </m:ctrlPr>
-                    </m:dPr>
-                    <m:e>
-                      <m:r>
-                        <w:rPr>
-                          <w:rFonts w:ascii="Cambria Math" w:hAnsi="Cambria Math" w:cs="Times New Roman"/>
-                          <w:sz w:val="24"/>
-                          <w:szCs w:val="24"/>
-                        </w:rPr>
-                        <m:t xml:space="preserve"> -8,3275%</m:t>
-                      </m:r>
-                    </m:e>
-                  </m:d>
-                </m:e>
-              </m:d>
-            </m:sub>
-            <m:sup/>
-            <m:e>
-              <m:func>
-                <m:funcPr>
-                  <m:ctrlPr>
-                    <w:rPr>
-                      <w:rFonts w:ascii="Cambria Math" w:hAnsi="Cambria Math" w:cs="Times New Roman"/>
-                      <w:i/>
-                      <w:sz w:val="24"/>
-                      <w:szCs w:val="24"/>
-                    </w:rPr>
-                  </m:ctrlPr>
-                </m:funcPr>
-                <m:fName>
-                  <m:limLow>
-                    <m:limLowPr>
-                      <m:ctrlPr>
-                        <w:rPr>
-                          <w:rFonts w:ascii="Cambria Math" w:hAnsi="Cambria Math" w:cs="Times New Roman"/>
-                          <w:i/>
-                          <w:sz w:val="24"/>
-                          <w:szCs w:val="24"/>
-                        </w:rPr>
-                      </m:ctrlPr>
-                    </m:limLowPr>
-                    <m:e>
-                      <m:r>
-                        <m:rPr>
-                          <m:sty m:val="p"/>
-                        </m:rPr>
-                        <w:rPr>
-                          <w:rFonts w:ascii="Cambria Math" w:hAnsi="Cambria Math" w:cs="Times New Roman"/>
-                          <w:sz w:val="24"/>
-                          <w:szCs w:val="24"/>
-                        </w:rPr>
-                        <m:t>lim</m:t>
-                      </m:r>
-                    </m:e>
-                    <m:lim>
-                      <m:d>
-                        <m:dPr>
-                          <m:ctrlPr>
-                            <w:rPr>
-                              <w:rFonts w:ascii="Cambria Math" w:hAnsi="Cambria Math" w:cs="Times New Roman"/>
-                              <w:i/>
-                              <w:sz w:val="24"/>
-                              <w:szCs w:val="24"/>
-                            </w:rPr>
-                          </m:ctrlPr>
-                        </m:dPr>
-                        <m:e>
-                          <m:r>
-                            <w:rPr>
-                              <w:rFonts w:ascii="Cambria Math" w:hAnsi="Cambria Math" w:cs="Times New Roman"/>
-                              <w:sz w:val="24"/>
-                              <w:szCs w:val="24"/>
-                            </w:rPr>
-                            <m:t>ζ</m:t>
-                          </m:r>
-                          <m:d>
-                            <m:dPr>
-                              <m:begChr m:val="{"/>
-                              <m:endChr m:val="}"/>
-                              <m:ctrlPr>
-                                <w:rPr>
-                                  <w:rFonts w:ascii="Cambria Math" w:hAnsi="Cambria Math" w:cs="Times New Roman"/>
-                                  <w:i/>
-                                  <w:sz w:val="24"/>
-                                  <w:szCs w:val="24"/>
-                                </w:rPr>
-                              </m:ctrlPr>
-                            </m:dPr>
-                            <m:e>
-                              <m:r>
-                                <w:rPr>
-                                  <w:rFonts w:ascii="Cambria Math" w:hAnsi="Cambria Math" w:cs="Times New Roman"/>
-                                  <w:sz w:val="24"/>
-                                  <w:szCs w:val="24"/>
-                                </w:rPr>
-                                <m:t>s</m:t>
-                              </m:r>
-                            </m:e>
-                          </m:d>
-                          <m:r>
-                            <w:rPr>
-                              <w:rFonts w:ascii="Cambria Math" w:hAnsi="Cambria Math" w:cs="Times New Roman"/>
-                              <w:sz w:val="24"/>
-                              <w:szCs w:val="24"/>
-                            </w:rPr>
-                            <m:t xml:space="preserve"> = </m:t>
-                          </m:r>
-                          <m:d>
-                            <m:dPr>
-                              <m:begChr m:val="{"/>
-                              <m:endChr m:val="}"/>
-                              <m:ctrlPr>
-                                <w:rPr>
-                                  <w:rFonts w:ascii="Cambria Math" w:hAnsi="Cambria Math" w:cs="Times New Roman"/>
-                                  <w:i/>
-                                  <w:sz w:val="24"/>
-                                  <w:szCs w:val="24"/>
-                                </w:rPr>
-                              </m:ctrlPr>
-                            </m:dPr>
-                            <m:e>
-                              <m:r>
-                                <w:rPr>
-                                  <w:rFonts w:ascii="Cambria Math" w:hAnsi="Cambria Math" w:cs="Times New Roman"/>
-                                  <w:sz w:val="24"/>
-                                  <w:szCs w:val="24"/>
-                                </w:rPr>
-                                <m:t xml:space="preserve"> -8,3275%</m:t>
-                              </m:r>
-                            </m:e>
-                          </m:d>
-                        </m:e>
-                      </m:d>
-                    </m:lim>
-                  </m:limLow>
-                </m:fName>
-                <m:e>
-                  <m:d>
-                    <m:dPr>
-                      <m:ctrlPr>
-                        <w:rPr>
-                          <w:rFonts w:ascii="Cambria Math" w:hAnsi="Cambria Math" w:cs="Times New Roman"/>
-                          <w:i/>
-                          <w:sz w:val="24"/>
-                          <w:szCs w:val="24"/>
-                        </w:rPr>
-                      </m:ctrlPr>
-                    </m:dPr>
-                    <m:e>
-                      <m:d>
-                        <m:dPr>
-                          <m:ctrlPr>
-                            <w:rPr>
-                              <w:rFonts w:ascii="Cambria Math" w:eastAsiaTheme="minorEastAsia" w:hAnsi="Cambria Math" w:cs="Times New Roman"/>
-                              <w:i/>
-                            </w:rPr>
-                          </m:ctrlPr>
-                        </m:dPr>
-                        <m:e>
-                          <m:sSup>
-                            <m:sSupPr>
-                              <m:ctrlPr>
-                                <w:rPr>
-                                  <w:rFonts w:ascii="Cambria Math" w:hAnsi="Cambria Math"/>
-                                  <w:i/>
-                                </w:rPr>
-                              </m:ctrlPr>
-                            </m:sSupPr>
-                            <m:e>
-                              <m:d>
-                                <m:dPr>
-                                  <m:ctrlPr>
-                                    <w:rPr>
-                                      <w:rFonts w:ascii="Cambria Math" w:hAnsi="Cambria Math"/>
-                                      <w:i/>
-                                    </w:rPr>
-                                  </m:ctrlPr>
-                                </m:dPr>
-                                <m:e>
-                                  <m:r>
-                                    <w:rPr>
-                                      <w:rFonts w:ascii="Cambria Math" w:hAnsi="Cambria Math"/>
-                                    </w:rPr>
-                                    <m:t>E + x</m:t>
-                                  </m:r>
-                                </m:e>
-                              </m:d>
-                            </m:e>
-                            <m:sup>
-                              <m:r>
-                                <w:rPr>
-                                  <w:rFonts w:ascii="Cambria Math" w:hAnsi="Cambria Math"/>
-                                </w:rPr>
-                                <m:t>n</m:t>
-                              </m:r>
-                            </m:sup>
-                          </m:sSup>
-                          <m:r>
-                            <w:rPr>
-                              <w:rFonts w:ascii="Cambria Math" w:hAnsi="Cambria Math"/>
-                            </w:rPr>
-                            <m:t xml:space="preserve"> - </m:t>
-                          </m:r>
-                          <m:sSup>
-                            <m:sSupPr>
-                              <m:ctrlPr>
-                                <w:rPr>
-                                  <w:rFonts w:ascii="Cambria Math" w:eastAsiaTheme="minorEastAsia" w:hAnsi="Cambria Math" w:cs="Times New Roman"/>
-                                  <w:i/>
-                                </w:rPr>
-                              </m:ctrlPr>
-                            </m:sSupPr>
-                            <m:e>
-                              <m:r>
-                                <w:rPr>
-                                  <w:rFonts w:ascii="Cambria Math" w:eastAsiaTheme="minorEastAsia" w:hAnsi="Cambria Math" w:cs="Times New Roman"/>
-                                </w:rPr>
-                                <m:t>E</m:t>
-                              </m:r>
-                            </m:e>
-                            <m:sup>
-                              <m:r>
-                                <w:rPr>
-                                  <w:rFonts w:ascii="Cambria Math" w:eastAsiaTheme="minorEastAsia" w:hAnsi="Cambria Math" w:cs="Times New Roman"/>
-                                </w:rPr>
-                                <m:t>n</m:t>
-                              </m:r>
-                            </m:sup>
-                          </m:sSup>
-                        </m:e>
-                      </m:d>
-                    </m:e>
-                  </m:d>
-                </m:e>
-              </m:func>
-            </m:e>
-          </m:nary>
-          <m:r>
-            <w:rPr>
-              <w:rFonts w:ascii="Cambria Math" w:hAnsi="Cambria Math" w:cs="Times New Roman"/>
-              <w:sz w:val="24"/>
-              <w:szCs w:val="24"/>
-            </w:rPr>
-            <m:t xml:space="preserve">= </m:t>
-          </m:r>
-          <m:nary>
-            <m:naryPr>
-              <m:chr m:val="∑"/>
-              <m:limLoc m:val="undOvr"/>
-              <m:supHide m:val="1"/>
-              <m:ctrlPr>
-                <w:rPr>
-                  <w:rFonts w:ascii="Cambria Math" w:hAnsi="Cambria Math" w:cs="Times New Roman"/>
-                  <w:i/>
-                  <w:sz w:val="24"/>
-                  <w:szCs w:val="24"/>
-                </w:rPr>
-              </m:ctrlPr>
-            </m:naryPr>
-            <m:sub>
-              <m:d>
-                <m:dPr>
-                  <m:ctrlPr>
-                    <w:rPr>
-                      <w:rFonts w:ascii="Cambria Math" w:hAnsi="Cambria Math" w:cs="Times New Roman"/>
-                      <w:i/>
-                      <w:sz w:val="24"/>
-                      <w:szCs w:val="24"/>
-                    </w:rPr>
-                  </m:ctrlPr>
-                </m:dPr>
-                <m:e>
-                  <m:r>
-                    <w:rPr>
-                      <w:rFonts w:ascii="Cambria Math" w:hAnsi="Cambria Math" w:cs="Times New Roman"/>
-                      <w:sz w:val="24"/>
-                      <w:szCs w:val="24"/>
-                    </w:rPr>
-                    <m:t>ζ</m:t>
-                  </m:r>
-                  <m:d>
-                    <m:dPr>
-                      <m:begChr m:val="{"/>
-                      <m:endChr m:val="}"/>
-                      <m:ctrlPr>
-                        <w:rPr>
-                          <w:rFonts w:ascii="Cambria Math" w:hAnsi="Cambria Math" w:cs="Times New Roman"/>
-                          <w:i/>
-                          <w:sz w:val="24"/>
-                          <w:szCs w:val="24"/>
-                        </w:rPr>
-                      </m:ctrlPr>
-                    </m:dPr>
-                    <m:e>
-                      <m:r>
-                        <w:rPr>
-                          <w:rFonts w:ascii="Cambria Math" w:hAnsi="Cambria Math" w:cs="Times New Roman"/>
-                          <w:sz w:val="24"/>
-                          <w:szCs w:val="24"/>
-                        </w:rPr>
-                        <m:t>s</m:t>
-                      </m:r>
-                    </m:e>
-                  </m:d>
-                  <m:r>
-                    <w:rPr>
-                      <w:rFonts w:ascii="Cambria Math" w:hAnsi="Cambria Math" w:cs="Times New Roman"/>
-                      <w:sz w:val="24"/>
-                      <w:szCs w:val="24"/>
-                    </w:rPr>
-                    <m:t xml:space="preserve"> = </m:t>
-                  </m:r>
-                  <m:d>
-                    <m:dPr>
-                      <m:begChr m:val="{"/>
-                      <m:endChr m:val="}"/>
-                      <m:ctrlPr>
-                        <w:rPr>
-                          <w:rFonts w:ascii="Cambria Math" w:hAnsi="Cambria Math" w:cs="Times New Roman"/>
-                          <w:i/>
-                          <w:sz w:val="24"/>
-                          <w:szCs w:val="24"/>
-                        </w:rPr>
-                      </m:ctrlPr>
-                    </m:dPr>
-                    <m:e>
-                      <m:r>
-                        <w:rPr>
-                          <w:rFonts w:ascii="Cambria Math" w:hAnsi="Cambria Math" w:cs="Times New Roman"/>
-                          <w:sz w:val="24"/>
-                          <w:szCs w:val="24"/>
-                        </w:rPr>
-                        <m:t xml:space="preserve"> -8,3275%</m:t>
-                      </m:r>
-                    </m:e>
-                  </m:d>
-                </m:e>
-              </m:d>
-            </m:sub>
-            <m:sup/>
-            <m:e>
-              <m:func>
-                <m:funcPr>
-                  <m:ctrlPr>
-                    <w:rPr>
-                      <w:rFonts w:ascii="Cambria Math" w:hAnsi="Cambria Math" w:cs="Times New Roman"/>
-                      <w:i/>
-                      <w:sz w:val="24"/>
-                      <w:szCs w:val="24"/>
-                    </w:rPr>
-                  </m:ctrlPr>
-                </m:funcPr>
-                <m:fName>
-                  <m:limLow>
-                    <m:limLowPr>
-                      <m:ctrlPr>
-                        <w:rPr>
-                          <w:rFonts w:ascii="Cambria Math" w:hAnsi="Cambria Math" w:cs="Times New Roman"/>
-                          <w:i/>
-                          <w:sz w:val="24"/>
-                          <w:szCs w:val="24"/>
-                        </w:rPr>
-                      </m:ctrlPr>
-                    </m:limLowPr>
-                    <m:e>
-                      <m:r>
-                        <m:rPr>
-                          <m:sty m:val="p"/>
-                        </m:rPr>
-                        <w:rPr>
-                          <w:rFonts w:ascii="Cambria Math" w:hAnsi="Cambria Math" w:cs="Times New Roman"/>
-                          <w:sz w:val="24"/>
-                          <w:szCs w:val="24"/>
-                        </w:rPr>
-                        <m:t>lim</m:t>
-                      </m:r>
-                    </m:e>
-                    <m:lim>
-                      <m:d>
-                        <m:dPr>
-                          <m:ctrlPr>
-                            <w:rPr>
-                              <w:rFonts w:ascii="Cambria Math" w:hAnsi="Cambria Math" w:cs="Times New Roman"/>
-                              <w:i/>
-                              <w:sz w:val="24"/>
-                              <w:szCs w:val="24"/>
-                            </w:rPr>
-                          </m:ctrlPr>
-                        </m:dPr>
-                        <m:e>
-                          <m:r>
-                            <w:rPr>
-                              <w:rFonts w:ascii="Cambria Math" w:hAnsi="Cambria Math" w:cs="Times New Roman"/>
-                              <w:sz w:val="24"/>
-                              <w:szCs w:val="24"/>
-                            </w:rPr>
-                            <m:t>ζ</m:t>
-                          </m:r>
-                          <m:d>
-                            <m:dPr>
-                              <m:begChr m:val="{"/>
-                              <m:endChr m:val="}"/>
-                              <m:ctrlPr>
-                                <w:rPr>
-                                  <w:rFonts w:ascii="Cambria Math" w:hAnsi="Cambria Math" w:cs="Times New Roman"/>
-                                  <w:i/>
-                                  <w:sz w:val="24"/>
-                                  <w:szCs w:val="24"/>
-                                </w:rPr>
-                              </m:ctrlPr>
-                            </m:dPr>
-                            <m:e>
-                              <m:r>
-                                <w:rPr>
-                                  <w:rFonts w:ascii="Cambria Math" w:hAnsi="Cambria Math" w:cs="Times New Roman"/>
-                                  <w:sz w:val="24"/>
-                                  <w:szCs w:val="24"/>
-                                </w:rPr>
-                                <m:t>s</m:t>
-                              </m:r>
-                            </m:e>
-                          </m:d>
-                          <m:r>
-                            <w:rPr>
-                              <w:rFonts w:ascii="Cambria Math" w:hAnsi="Cambria Math" w:cs="Times New Roman"/>
-                              <w:sz w:val="24"/>
-                              <w:szCs w:val="24"/>
-                            </w:rPr>
-                            <m:t xml:space="preserve"> = </m:t>
-                          </m:r>
-                          <m:d>
-                            <m:dPr>
-                              <m:begChr m:val="{"/>
-                              <m:endChr m:val="}"/>
-                              <m:ctrlPr>
-                                <w:rPr>
-                                  <w:rFonts w:ascii="Cambria Math" w:hAnsi="Cambria Math" w:cs="Times New Roman"/>
-                                  <w:i/>
-                                  <w:sz w:val="24"/>
-                                  <w:szCs w:val="24"/>
-                                </w:rPr>
-                              </m:ctrlPr>
-                            </m:dPr>
-                            <m:e>
-                              <m:r>
-                                <w:rPr>
-                                  <w:rFonts w:ascii="Cambria Math" w:hAnsi="Cambria Math" w:cs="Times New Roman"/>
-                                  <w:sz w:val="24"/>
-                                  <w:szCs w:val="24"/>
-                                </w:rPr>
-                                <m:t xml:space="preserve"> -8,3275%</m:t>
-                              </m:r>
-                            </m:e>
-                          </m:d>
-                        </m:e>
-                      </m:d>
-                    </m:lim>
-                  </m:limLow>
-                </m:fName>
-                <m:e>
-                  <m:d>
-                    <m:dPr>
-                      <m:ctrlPr>
-                        <w:rPr>
-                          <w:rFonts w:ascii="Cambria Math" w:hAnsi="Cambria Math" w:cs="Times New Roman"/>
-                          <w:i/>
-                          <w:sz w:val="24"/>
-                          <w:szCs w:val="24"/>
-                        </w:rPr>
-                      </m:ctrlPr>
-                    </m:dPr>
-                    <m:e>
-                      <m:f>
-                        <m:fPr>
-                          <m:ctrlPr>
-                            <w:rPr>
-                              <w:rFonts w:ascii="Cambria Math" w:eastAsiaTheme="minorEastAsia" w:hAnsi="Cambria Math" w:cs="Times New Roman"/>
-                              <w:i/>
-                              <w:sz w:val="24"/>
-                              <w:szCs w:val="24"/>
-                            </w:rPr>
-                          </m:ctrlPr>
-                        </m:fPr>
-                        <m:num>
-                          <m:d>
-                            <m:dPr>
-                              <m:begChr m:val="{"/>
-                              <m:endChr m:val="}"/>
-                              <m:ctrlPr>
-                                <w:rPr>
-                                  <w:rFonts w:ascii="Cambria Math" w:eastAsiaTheme="minorEastAsia" w:hAnsi="Cambria Math" w:cs="Times New Roman"/>
-                                  <w:i/>
-                                  <w:sz w:val="24"/>
-                                  <w:szCs w:val="24"/>
-                                </w:rPr>
-                              </m:ctrlPr>
-                            </m:dPr>
-                            <m:e>
-                              <m:d>
-                                <m:dPr>
-                                  <m:ctrlPr>
-                                    <w:rPr>
-                                      <w:rFonts w:ascii="Cambria Math" w:eastAsiaTheme="minorEastAsia" w:hAnsi="Cambria Math" w:cs="Times New Roman"/>
-                                      <w:i/>
-                                      <w:sz w:val="24"/>
-                                      <w:szCs w:val="24"/>
-                                    </w:rPr>
-                                  </m:ctrlPr>
-                                </m:dPr>
-                                <m:e>
-                                  <m:nary>
-                                    <m:naryPr>
-                                      <m:limLoc m:val="undOvr"/>
-                                      <m:subHide m:val="1"/>
-                                      <m:supHide m:val="1"/>
-                                      <m:ctrlPr>
-                                        <w:rPr>
-                                          <w:rFonts w:ascii="Cambria Math" w:eastAsiaTheme="minorEastAsia" w:hAnsi="Cambria Math" w:cs="Times New Roman"/>
-                                          <w:i/>
-                                          <w:sz w:val="24"/>
-                                          <w:szCs w:val="24"/>
-                                        </w:rPr>
-                                      </m:ctrlPr>
-                                    </m:naryPr>
-                                    <m:sub/>
-                                    <m:sup/>
-                                    <m:e>
-                                      <m:d>
-                                        <m:dPr>
-                                          <m:ctrlPr>
-                                            <w:rPr>
-                                              <w:rFonts w:ascii="Cambria Math" w:eastAsiaTheme="minorEastAsia" w:hAnsi="Cambria Math" w:cs="Times New Roman"/>
-                                              <w:i/>
-                                              <w:sz w:val="24"/>
-                                              <w:szCs w:val="24"/>
-                                            </w:rPr>
-                                          </m:ctrlPr>
-                                        </m:dPr>
-                                        <m:e>
-                                          <m:sSup>
-                                            <m:sSupPr>
-                                              <m:ctrlPr>
-                                                <w:rPr>
-                                                  <w:rFonts w:ascii="Cambria Math" w:eastAsiaTheme="minorEastAsia" w:hAnsi="Cambria Math" w:cs="Times New Roman"/>
-                                                  <w:i/>
-                                                  <w:sz w:val="24"/>
-                                                  <w:szCs w:val="24"/>
-                                                </w:rPr>
-                                              </m:ctrlPr>
-                                            </m:sSupPr>
-                                            <m:e>
-                                              <m:r>
-                                                <w:rPr>
-                                                  <w:rFonts w:ascii="Cambria Math" w:eastAsiaTheme="minorEastAsia" w:hAnsi="Cambria Math" w:cs="Times New Roman"/>
-                                                  <w:sz w:val="24"/>
-                                                  <w:szCs w:val="24"/>
-                                                </w:rPr>
-                                                <m:t>E</m:t>
-                                              </m:r>
-                                            </m:e>
-                                            <m:sup>
-                                              <m:r>
-                                                <w:rPr>
-                                                  <w:rFonts w:ascii="Cambria Math" w:eastAsiaTheme="minorEastAsia" w:hAnsi="Cambria Math" w:cs="Times New Roman"/>
-                                                  <w:sz w:val="24"/>
-                                                  <w:szCs w:val="24"/>
-                                                </w:rPr>
-                                                <m:t>E</m:t>
-                                              </m:r>
-                                            </m:sup>
-                                          </m:sSup>
-                                        </m:e>
-                                      </m:d>
-                                    </m:e>
-                                  </m:nary>
-                                  <m:r>
-                                    <w:rPr>
-                                      <w:rFonts w:ascii="Cambria Math" w:eastAsiaTheme="minorEastAsia" w:hAnsi="Cambria Math" w:cs="Times New Roman"/>
-                                      <w:sz w:val="24"/>
-                                      <w:szCs w:val="24"/>
-                                    </w:rPr>
-                                    <m:t xml:space="preserve"> × </m:t>
-                                  </m:r>
-                                  <m:d>
-                                    <m:dPr>
-                                      <m:begChr m:val="{"/>
-                                      <m:endChr m:val="}"/>
-                                      <m:ctrlPr>
-                                        <w:rPr>
-                                          <w:rFonts w:ascii="Cambria Math" w:eastAsiaTheme="minorEastAsia" w:hAnsi="Cambria Math" w:cs="Times New Roman"/>
-                                          <w:i/>
-                                          <w:sz w:val="24"/>
-                                          <w:szCs w:val="24"/>
-                                        </w:rPr>
-                                      </m:ctrlPr>
-                                    </m:dPr>
-                                    <m:e>
-                                      <m:f>
-                                        <m:fPr>
-                                          <m:ctrlPr>
-                                            <w:rPr>
-                                              <w:rFonts w:ascii="Cambria Math" w:hAnsi="Cambria Math" w:cs="Times New Roman"/>
-                                              <w:i/>
-                                              <w:sz w:val="24"/>
-                                              <w:szCs w:val="24"/>
-                                            </w:rPr>
-                                          </m:ctrlPr>
-                                        </m:fPr>
-                                        <m:num>
-                                          <m:box>
-                                            <m:boxPr>
-                                              <m:diff m:val="1"/>
-                                              <m:ctrlPr>
-                                                <w:rPr>
-                                                  <w:rFonts w:ascii="Cambria Math" w:hAnsi="Cambria Math" w:cs="Times New Roman"/>
-                                                  <w:i/>
-                                                  <w:sz w:val="24"/>
-                                                  <w:szCs w:val="24"/>
-                                                </w:rPr>
-                                              </m:ctrlPr>
-                                            </m:boxPr>
-                                            <m:e>
-                                              <m:r>
-                                                <w:rPr>
-                                                  <w:rFonts w:ascii="Cambria Math" w:hAnsi="Cambria Math" w:cs="Times New Roman"/>
-                                                  <w:sz w:val="24"/>
-                                                  <w:szCs w:val="24"/>
-                                                </w:rPr>
-                                                <m:t>d</m:t>
-                                              </m:r>
-                                            </m:e>
-                                          </m:box>
-                                        </m:num>
-                                        <m:den>
-                                          <m:r>
-                                            <w:rPr>
-                                              <w:rFonts w:ascii="Cambria Math" w:hAnsi="Cambria Math" w:cs="Times New Roman"/>
-                                              <w:sz w:val="24"/>
-                                              <w:szCs w:val="24"/>
-                                            </w:rPr>
-                                            <m:t>dt</m:t>
-                                          </m:r>
-                                        </m:den>
-                                      </m:f>
-                                      <m:d>
-                                        <m:dPr>
-                                          <m:ctrlPr>
-                                            <w:rPr>
-                                              <w:rFonts w:ascii="Cambria Math" w:hAnsi="Cambria Math"/>
-                                              <w:i/>
-                                            </w:rPr>
-                                          </m:ctrlPr>
-                                        </m:dPr>
-                                        <m:e>
-                                          <m:sSup>
-                                            <m:sSupPr>
-                                              <m:ctrlPr>
-                                                <w:rPr>
-                                                  <w:rFonts w:ascii="Cambria Math" w:hAnsi="Cambria Math"/>
-                                                  <w:i/>
-                                                </w:rPr>
-                                              </m:ctrlPr>
-                                            </m:sSupPr>
-                                            <m:e>
-                                              <m:r>
-                                                <w:rPr>
-                                                  <w:rFonts w:ascii="Cambria Math" w:hAnsi="Cambria Math"/>
-                                                </w:rPr>
-                                                <m:t>x</m:t>
-                                              </m:r>
-                                            </m:e>
-                                            <m:sup>
-                                              <m:r>
-                                                <w:rPr>
-                                                  <w:rFonts w:ascii="Cambria Math" w:hAnsi="Cambria Math"/>
-                                                </w:rPr>
-                                                <m:t>n</m:t>
-                                              </m:r>
-                                            </m:sup>
-                                          </m:sSup>
-                                          <m:r>
-                                            <w:rPr>
-                                              <w:rFonts w:ascii="Cambria Math" w:hAnsi="Cambria Math"/>
-                                            </w:rPr>
-                                            <m:t xml:space="preserve"> + </m:t>
-                                          </m:r>
-                                          <m:d>
-                                            <m:dPr>
-                                              <m:begChr m:val="{"/>
-                                              <m:endChr m:val="}"/>
-                                              <m:ctrlPr>
-                                                <w:rPr>
-                                                  <w:rFonts w:ascii="Cambria Math" w:hAnsi="Cambria Math"/>
-                                                  <w:i/>
-                                                </w:rPr>
-                                              </m:ctrlPr>
-                                            </m:dPr>
-                                            <m:e>
-                                              <m:r>
-                                                <w:rPr>
-                                                  <w:rFonts w:ascii="Cambria Math" w:hAnsi="Cambria Math"/>
-                                                </w:rPr>
-                                                <m:t>x × E × n</m:t>
-                                              </m:r>
-                                            </m:e>
-                                          </m:d>
-                                          <m:r>
-                                            <w:rPr>
-                                              <w:rFonts w:ascii="Cambria Math" w:hAnsi="Cambria Math"/>
-                                            </w:rPr>
-                                            <m:t xml:space="preserve"> - </m:t>
-                                          </m:r>
-                                          <m:sSup>
-                                            <m:sSupPr>
-                                              <m:ctrlPr>
-                                                <w:rPr>
-                                                  <w:rFonts w:ascii="Cambria Math" w:hAnsi="Cambria Math"/>
-                                                  <w:i/>
-                                                </w:rPr>
-                                              </m:ctrlPr>
-                                            </m:sSupPr>
-                                            <m:e>
-                                              <m:d>
-                                                <m:dPr>
-                                                  <m:begChr m:val="{"/>
-                                                  <m:endChr m:val="}"/>
-                                                  <m:ctrlPr>
-                                                    <w:rPr>
-                                                      <w:rFonts w:ascii="Cambria Math" w:hAnsi="Cambria Math"/>
-                                                      <w:i/>
-                                                    </w:rPr>
-                                                  </m:ctrlPr>
-                                                </m:dPr>
-                                                <m:e>
-                                                  <m:r>
-                                                    <w:rPr>
-                                                      <w:rFonts w:ascii="Cambria Math" w:hAnsi="Cambria Math"/>
-                                                    </w:rPr>
-                                                    <m:t>E × x</m:t>
-                                                  </m:r>
-                                                </m:e>
-                                              </m:d>
-                                            </m:e>
-                                            <m:sup>
-                                              <m:d>
-                                                <m:dPr>
-                                                  <m:ctrlPr>
-                                                    <w:rPr>
-                                                      <w:rFonts w:ascii="Cambria Math" w:hAnsi="Cambria Math"/>
-                                                      <w:i/>
-                                                    </w:rPr>
-                                                  </m:ctrlPr>
-                                                </m:dPr>
-                                                <m:e>
-                                                  <m:r>
-                                                    <w:rPr>
-                                                      <w:rFonts w:ascii="Cambria Math" w:hAnsi="Cambria Math"/>
-                                                    </w:rPr>
-                                                    <m:t>n - 1</m:t>
-                                                  </m:r>
-                                                </m:e>
-                                              </m:d>
-                                            </m:sup>
-                                          </m:sSup>
-                                          <m:r>
-                                            <w:rPr>
-                                              <w:rFonts w:ascii="Cambria Math" w:hAnsi="Cambria Math"/>
-                                            </w:rPr>
-                                            <m:t xml:space="preserve"> + </m:t>
-                                          </m:r>
-                                          <m:sSup>
-                                            <m:sSupPr>
-                                              <m:ctrlPr>
-                                                <w:rPr>
-                                                  <w:rFonts w:ascii="Cambria Math" w:hAnsi="Cambria Math"/>
-                                                  <w:i/>
-                                                </w:rPr>
-                                              </m:ctrlPr>
-                                            </m:sSupPr>
-                                            <m:e>
-                                              <m:r>
-                                                <w:rPr>
-                                                  <w:rFonts w:ascii="Cambria Math" w:hAnsi="Cambria Math"/>
-                                                </w:rPr>
-                                                <m:t>E</m:t>
-                                              </m:r>
-                                            </m:e>
-                                            <m:sup>
-                                              <m:d>
-                                                <m:dPr>
-                                                  <m:ctrlPr>
-                                                    <w:rPr>
-                                                      <w:rFonts w:ascii="Cambria Math" w:hAnsi="Cambria Math"/>
-                                                      <w:i/>
-                                                    </w:rPr>
-                                                  </m:ctrlPr>
-                                                </m:dPr>
-                                                <m:e>
-                                                  <m:d>
-                                                    <m:dPr>
-                                                      <m:ctrlPr>
-                                                        <w:rPr>
-                                                          <w:rFonts w:ascii="Cambria Math" w:hAnsi="Cambria Math"/>
-                                                          <w:i/>
-                                                        </w:rPr>
-                                                      </m:ctrlPr>
-                                                    </m:dPr>
-                                                    <m:e>
-                                                      <m:r>
-                                                        <w:rPr>
-                                                          <w:rFonts w:ascii="Cambria Math" w:hAnsi="Cambria Math"/>
-                                                        </w:rPr>
-                                                        <m:t>2 × n</m:t>
-                                                      </m:r>
-                                                    </m:e>
-                                                  </m:d>
-                                                  <m:r>
-                                                    <w:rPr>
-                                                      <w:rFonts w:ascii="Cambria Math" w:hAnsi="Cambria Math"/>
-                                                    </w:rPr>
-                                                    <m:t xml:space="preserve"> - 1</m:t>
-                                                  </m:r>
-                                                </m:e>
-                                              </m:d>
-                                            </m:sup>
-                                          </m:sSup>
-                                        </m:e>
-                                      </m:d>
-                                    </m:e>
-                                  </m:d>
-                                </m:e>
-                              </m:d>
-                              <m:r>
-                                <w:rPr>
-                                  <w:rFonts w:ascii="Cambria Math" w:eastAsiaTheme="minorEastAsia" w:hAnsi="Cambria Math" w:cs="Times New Roman"/>
-                                  <w:sz w:val="24"/>
-                                  <w:szCs w:val="24"/>
-                                </w:rPr>
-                                <m:t xml:space="preserve">- </m:t>
-                              </m:r>
-                              <m:nary>
-                                <m:naryPr>
-                                  <m:limLoc m:val="undOvr"/>
-                                  <m:subHide m:val="1"/>
-                                  <m:supHide m:val="1"/>
-                                  <m:ctrlPr>
-                                    <w:rPr>
-                                      <w:rFonts w:ascii="Cambria Math" w:eastAsiaTheme="minorEastAsia" w:hAnsi="Cambria Math" w:cs="Times New Roman"/>
-                                      <w:i/>
-                                      <w:sz w:val="24"/>
-                                      <w:szCs w:val="24"/>
-                                    </w:rPr>
-                                  </m:ctrlPr>
-                                </m:naryPr>
-                                <m:sub/>
-                                <m:sup/>
-                                <m:e>
-                                  <m:d>
-                                    <m:dPr>
-                                      <m:ctrlPr>
-                                        <w:rPr>
-                                          <w:rFonts w:ascii="Cambria Math" w:eastAsiaTheme="minorEastAsia" w:hAnsi="Cambria Math" w:cs="Times New Roman"/>
-                                          <w:i/>
-                                          <w:sz w:val="24"/>
-                                          <w:szCs w:val="24"/>
-                                        </w:rPr>
-                                      </m:ctrlPr>
-                                    </m:dPr>
-                                    <m:e>
-                                      <m:sSup>
-                                        <m:sSupPr>
-                                          <m:ctrlPr>
-                                            <w:rPr>
-                                              <w:rFonts w:ascii="Cambria Math" w:eastAsiaTheme="minorEastAsia" w:hAnsi="Cambria Math" w:cs="Times New Roman"/>
-                                              <w:i/>
-                                              <w:sz w:val="24"/>
-                                              <w:szCs w:val="24"/>
-                                            </w:rPr>
-                                          </m:ctrlPr>
-                                        </m:sSupPr>
-                                        <m:e>
-                                          <m:r>
-                                            <w:rPr>
-                                              <w:rFonts w:ascii="Cambria Math" w:eastAsiaTheme="minorEastAsia" w:hAnsi="Cambria Math" w:cs="Times New Roman"/>
-                                              <w:sz w:val="24"/>
-                                              <w:szCs w:val="24"/>
-                                            </w:rPr>
-                                            <m:t>E</m:t>
-                                          </m:r>
-                                        </m:e>
-                                        <m:sup>
-                                          <m:r>
-                                            <w:rPr>
-                                              <w:rFonts w:ascii="Cambria Math" w:eastAsiaTheme="minorEastAsia" w:hAnsi="Cambria Math" w:cs="Times New Roman"/>
-                                              <w:sz w:val="24"/>
-                                              <w:szCs w:val="24"/>
-                                            </w:rPr>
-                                            <m:t>E</m:t>
-                                          </m:r>
-                                        </m:sup>
-                                      </m:sSup>
-                                    </m:e>
-                                  </m:d>
-                                </m:e>
-                              </m:nary>
-                            </m:e>
-                          </m:d>
-                        </m:num>
-                        <m:den>
-                          <m:d>
-                            <m:dPr>
-                              <m:begChr m:val="{"/>
-                              <m:endChr m:val="}"/>
-                              <m:ctrlPr>
-                                <w:rPr>
-                                  <w:rFonts w:ascii="Cambria Math" w:eastAsiaTheme="minorEastAsia" w:hAnsi="Cambria Math" w:cs="Times New Roman"/>
-                                  <w:i/>
-                                  <w:sz w:val="24"/>
-                                  <w:szCs w:val="24"/>
-                                </w:rPr>
-                              </m:ctrlPr>
-                            </m:dPr>
-                            <m:e>
-                              <m:f>
-                                <m:fPr>
-                                  <m:ctrlPr>
-                                    <w:rPr>
-                                      <w:rFonts w:ascii="Cambria Math" w:hAnsi="Cambria Math" w:cs="Times New Roman"/>
-                                      <w:i/>
-                                      <w:sz w:val="24"/>
-                                      <w:szCs w:val="24"/>
-                                    </w:rPr>
-                                  </m:ctrlPr>
-                                </m:fPr>
-                                <m:num>
-                                  <m:box>
-                                    <m:boxPr>
-                                      <m:diff m:val="1"/>
-                                      <m:ctrlPr>
-                                        <w:rPr>
-                                          <w:rFonts w:ascii="Cambria Math" w:hAnsi="Cambria Math" w:cs="Times New Roman"/>
-                                          <w:i/>
-                                          <w:sz w:val="24"/>
-                                          <w:szCs w:val="24"/>
-                                        </w:rPr>
-                                      </m:ctrlPr>
-                                    </m:boxPr>
-                                    <m:e>
-                                      <m:r>
-                                        <w:rPr>
-                                          <w:rFonts w:ascii="Cambria Math" w:hAnsi="Cambria Math" w:cs="Times New Roman"/>
-                                          <w:sz w:val="24"/>
-                                          <w:szCs w:val="24"/>
-                                        </w:rPr>
-                                        <m:t>d</m:t>
-                                      </m:r>
-                                    </m:e>
-                                  </m:box>
-                                </m:num>
-                                <m:den>
-                                  <m:r>
-                                    <w:rPr>
-                                      <w:rFonts w:ascii="Cambria Math" w:hAnsi="Cambria Math" w:cs="Times New Roman"/>
-                                      <w:sz w:val="24"/>
-                                      <w:szCs w:val="24"/>
-                                    </w:rPr>
-                                    <m:t>dt</m:t>
-                                  </m:r>
-                                </m:den>
-                              </m:f>
-                              <m:d>
-                                <m:dPr>
-                                  <m:ctrlPr>
-                                    <w:rPr>
-                                      <w:rFonts w:ascii="Cambria Math" w:hAnsi="Cambria Math"/>
-                                      <w:i/>
-                                    </w:rPr>
-                                  </m:ctrlPr>
-                                </m:dPr>
-                                <m:e>
-                                  <m:sSup>
-                                    <m:sSupPr>
-                                      <m:ctrlPr>
-                                        <w:rPr>
-                                          <w:rFonts w:ascii="Cambria Math" w:hAnsi="Cambria Math"/>
-                                          <w:i/>
-                                        </w:rPr>
-                                      </m:ctrlPr>
-                                    </m:sSupPr>
-                                    <m:e>
-                                      <m:r>
-                                        <w:rPr>
-                                          <w:rFonts w:ascii="Cambria Math" w:hAnsi="Cambria Math"/>
-                                        </w:rPr>
-                                        <m:t>x</m:t>
-                                      </m:r>
-                                    </m:e>
-                                    <m:sup>
-                                      <m:r>
-                                        <w:rPr>
-                                          <w:rFonts w:ascii="Cambria Math" w:hAnsi="Cambria Math"/>
-                                        </w:rPr>
-                                        <m:t>n</m:t>
-                                      </m:r>
-                                    </m:sup>
-                                  </m:sSup>
-                                  <m:r>
-                                    <w:rPr>
-                                      <w:rFonts w:ascii="Cambria Math" w:hAnsi="Cambria Math"/>
-                                    </w:rPr>
-                                    <m:t xml:space="preserve"> + </m:t>
-                                  </m:r>
-                                  <m:d>
-                                    <m:dPr>
-                                      <m:begChr m:val="{"/>
-                                      <m:endChr m:val="}"/>
-                                      <m:ctrlPr>
-                                        <w:rPr>
-                                          <w:rFonts w:ascii="Cambria Math" w:hAnsi="Cambria Math"/>
-                                          <w:i/>
-                                        </w:rPr>
-                                      </m:ctrlPr>
-                                    </m:dPr>
-                                    <m:e>
-                                      <m:r>
-                                        <w:rPr>
-                                          <w:rFonts w:ascii="Cambria Math" w:hAnsi="Cambria Math"/>
-                                        </w:rPr>
-                                        <m:t>x × E × n</m:t>
-                                      </m:r>
-                                    </m:e>
-                                  </m:d>
-                                  <m:r>
-                                    <w:rPr>
-                                      <w:rFonts w:ascii="Cambria Math" w:hAnsi="Cambria Math"/>
-                                    </w:rPr>
-                                    <m:t xml:space="preserve"> - </m:t>
-                                  </m:r>
-                                  <m:sSup>
-                                    <m:sSupPr>
-                                      <m:ctrlPr>
-                                        <w:rPr>
-                                          <w:rFonts w:ascii="Cambria Math" w:hAnsi="Cambria Math"/>
-                                          <w:i/>
-                                        </w:rPr>
-                                      </m:ctrlPr>
-                                    </m:sSupPr>
-                                    <m:e>
-                                      <m:d>
-                                        <m:dPr>
-                                          <m:begChr m:val="{"/>
-                                          <m:endChr m:val="}"/>
-                                          <m:ctrlPr>
-                                            <w:rPr>
-                                              <w:rFonts w:ascii="Cambria Math" w:hAnsi="Cambria Math"/>
-                                              <w:i/>
-                                            </w:rPr>
-                                          </m:ctrlPr>
-                                        </m:dPr>
-                                        <m:e>
-                                          <m:r>
-                                            <w:rPr>
-                                              <w:rFonts w:ascii="Cambria Math" w:hAnsi="Cambria Math"/>
-                                            </w:rPr>
-                                            <m:t>E × x</m:t>
-                                          </m:r>
-                                        </m:e>
-                                      </m:d>
-                                    </m:e>
-                                    <m:sup>
-                                      <m:d>
-                                        <m:dPr>
-                                          <m:ctrlPr>
-                                            <w:rPr>
-                                              <w:rFonts w:ascii="Cambria Math" w:hAnsi="Cambria Math"/>
-                                              <w:i/>
-                                            </w:rPr>
-                                          </m:ctrlPr>
-                                        </m:dPr>
-                                        <m:e>
-                                          <m:r>
-                                            <w:rPr>
-                                              <w:rFonts w:ascii="Cambria Math" w:hAnsi="Cambria Math"/>
-                                            </w:rPr>
-                                            <m:t>n - 1</m:t>
-                                          </m:r>
-                                        </m:e>
-                                      </m:d>
-                                    </m:sup>
-                                  </m:sSup>
-                                  <m:r>
-                                    <w:rPr>
-                                      <w:rFonts w:ascii="Cambria Math" w:hAnsi="Cambria Math"/>
-                                    </w:rPr>
-                                    <m:t xml:space="preserve"> + </m:t>
-                                  </m:r>
-                                  <m:sSup>
-                                    <m:sSupPr>
-                                      <m:ctrlPr>
-                                        <w:rPr>
-                                          <w:rFonts w:ascii="Cambria Math" w:hAnsi="Cambria Math"/>
-                                          <w:i/>
-                                        </w:rPr>
-                                      </m:ctrlPr>
-                                    </m:sSupPr>
-                                    <m:e>
-                                      <m:r>
-                                        <w:rPr>
-                                          <w:rFonts w:ascii="Cambria Math" w:hAnsi="Cambria Math"/>
-                                        </w:rPr>
-                                        <m:t>E</m:t>
-                                      </m:r>
-                                    </m:e>
-                                    <m:sup>
-                                      <m:d>
-                                        <m:dPr>
-                                          <m:ctrlPr>
-                                            <w:rPr>
-                                              <w:rFonts w:ascii="Cambria Math" w:hAnsi="Cambria Math"/>
-                                              <w:i/>
-                                            </w:rPr>
-                                          </m:ctrlPr>
-                                        </m:dPr>
-                                        <m:e>
-                                          <m:d>
-                                            <m:dPr>
-                                              <m:ctrlPr>
-                                                <w:rPr>
-                                                  <w:rFonts w:ascii="Cambria Math" w:hAnsi="Cambria Math"/>
-                                                  <w:i/>
-                                                </w:rPr>
-                                              </m:ctrlPr>
-                                            </m:dPr>
-                                            <m:e>
-                                              <m:r>
-                                                <w:rPr>
-                                                  <w:rFonts w:ascii="Cambria Math" w:hAnsi="Cambria Math"/>
-                                                </w:rPr>
-                                                <m:t>2 × n</m:t>
-                                              </m:r>
-                                            </m:e>
-                                          </m:d>
-                                          <m:r>
-                                            <w:rPr>
-                                              <w:rFonts w:ascii="Cambria Math" w:hAnsi="Cambria Math"/>
-                                            </w:rPr>
-                                            <m:t xml:space="preserve"> - 1</m:t>
-                                          </m:r>
-                                        </m:e>
-                                      </m:d>
-                                    </m:sup>
-                                  </m:sSup>
-                                </m:e>
-                              </m:d>
-                            </m:e>
-                          </m:d>
-                        </m:den>
-                      </m:f>
-                    </m:e>
-                  </m:d>
-                </m:e>
-              </m:func>
-            </m:e>
-          </m:nary>
-        </m:oMath>
-      </m:oMathPara>
+      <m:oMath>
+        <m:nary>
+          <m:naryPr>
+            <m:chr m:val="∑"/>
+            <m:limLoc m:val="undOvr"/>
+            <m:supHide m:val="1"/>
+            <m:ctrlPr>
+              <w:rPr>
+                <w:rFonts w:ascii="Cambria Math" w:hAnsi="Cambria Math" w:cs="Times New Roman"/>
+                <w:i/>
+                <w:sz w:val="24"/>
+                <w:szCs w:val="24"/>
+              </w:rPr>
+            </m:ctrlPr>
+          </m:naryPr>
+          <m:sub>
+            <m:d>
+              <m:dPr>
+                <m:ctrlPr>
+                  <w:rPr>
+                    <w:rFonts w:ascii="Cambria Math" w:hAnsi="Cambria Math" w:cs="Times New Roman"/>
+                    <w:i/>
+                    <w:sz w:val="24"/>
+                    <w:szCs w:val="24"/>
+                  </w:rPr>
+                </m:ctrlPr>
+              </m:dPr>
+              <m:e>
+                <m:r>
+                  <w:rPr>
+                    <w:rFonts w:ascii="Cambria Math" w:hAnsi="Cambria Math" w:cs="Times New Roman"/>
+                    <w:sz w:val="24"/>
+                    <w:szCs w:val="24"/>
+                    <w:lang w:val="id-ID"/>
+                  </w:rPr>
+                  <m:t>ζ</m:t>
+                </m:r>
+                <m:d>
+                  <m:dPr>
+                    <m:begChr m:val="{"/>
+                    <m:endChr m:val="}"/>
+                    <m:ctrlPr>
+                      <w:rPr>
+                        <w:rFonts w:ascii="Cambria Math" w:hAnsi="Cambria Math" w:cs="Times New Roman"/>
+                        <w:i/>
+                        <w:sz w:val="24"/>
+                        <w:szCs w:val="24"/>
+                      </w:rPr>
+                    </m:ctrlPr>
+                  </m:dPr>
+                  <m:e>
+                    <m:r>
+                      <w:rPr>
+                        <w:rFonts w:ascii="Cambria Math" w:hAnsi="Cambria Math" w:cs="Times New Roman"/>
+                        <w:sz w:val="24"/>
+                        <w:szCs w:val="24"/>
+                        <w:lang w:val="id-ID"/>
+                      </w:rPr>
+                      <m:t>s</m:t>
+                    </m:r>
+                  </m:e>
+                </m:d>
+                <m:r>
+                  <w:rPr>
+                    <w:rFonts w:ascii="Cambria Math" w:hAnsi="Cambria Math" w:cs="Times New Roman"/>
+                    <w:sz w:val="24"/>
+                    <w:szCs w:val="24"/>
+                    <w:lang w:val="id-ID"/>
+                  </w:rPr>
+                  <m:t xml:space="preserve"> = </m:t>
+                </m:r>
+                <m:d>
+                  <m:dPr>
+                    <m:begChr m:val="{"/>
+                    <m:endChr m:val="}"/>
+                    <m:ctrlPr>
+                      <w:rPr>
+                        <w:rFonts w:ascii="Cambria Math" w:hAnsi="Cambria Math" w:cs="Times New Roman"/>
+                        <w:i/>
+                        <w:sz w:val="24"/>
+                        <w:szCs w:val="24"/>
+                      </w:rPr>
+                    </m:ctrlPr>
+                  </m:dPr>
+                  <m:e>
+                    <m:r>
+                      <w:rPr>
+                        <w:rFonts w:ascii="Cambria Math" w:hAnsi="Cambria Math" w:cs="Times New Roman"/>
+                        <w:sz w:val="24"/>
+                        <w:szCs w:val="24"/>
+                        <w:lang w:val="id-ID"/>
+                      </w:rPr>
+                      <m:t xml:space="preserve"> -8,3275%</m:t>
+                    </m:r>
+                  </m:e>
+                </m:d>
+              </m:e>
+            </m:d>
+          </m:sub>
+          <m:sup/>
+          <m:e>
+            <m:func>
+              <m:funcPr>
+                <m:ctrlPr>
+                  <w:rPr>
+                    <w:rFonts w:ascii="Cambria Math" w:hAnsi="Cambria Math" w:cs="Times New Roman"/>
+                    <w:i/>
+                    <w:sz w:val="24"/>
+                    <w:szCs w:val="24"/>
+                  </w:rPr>
+                </m:ctrlPr>
+              </m:funcPr>
+              <m:fName>
+                <m:limLow>
+                  <m:limLowPr>
+                    <m:ctrlPr>
+                      <w:rPr>
+                        <w:rFonts w:ascii="Cambria Math" w:hAnsi="Cambria Math" w:cs="Times New Roman"/>
+                        <w:i/>
+                        <w:sz w:val="24"/>
+                        <w:szCs w:val="24"/>
+                      </w:rPr>
+                    </m:ctrlPr>
+                  </m:limLowPr>
+                  <m:e>
+                    <m:r>
+                      <m:rPr>
+                        <m:sty m:val="p"/>
+                      </m:rPr>
+                      <w:rPr>
+                        <w:rFonts w:ascii="Cambria Math" w:hAnsi="Cambria Math" w:cs="Times New Roman"/>
+                        <w:sz w:val="24"/>
+                        <w:szCs w:val="24"/>
+                        <w:lang w:val="id-ID"/>
+                      </w:rPr>
+                      <m:t>lim</m:t>
+                    </m:r>
+                  </m:e>
+                  <m:lim>
+                    <m:d>
+                      <m:dPr>
+                        <m:ctrlPr>
+                          <w:rPr>
+                            <w:rFonts w:ascii="Cambria Math" w:hAnsi="Cambria Math" w:cs="Times New Roman"/>
+                            <w:i/>
+                            <w:sz w:val="24"/>
+                            <w:szCs w:val="24"/>
+                          </w:rPr>
+                        </m:ctrlPr>
+                      </m:dPr>
+                      <m:e>
+                        <m:r>
+                          <w:rPr>
+                            <w:rFonts w:ascii="Cambria Math" w:hAnsi="Cambria Math" w:cs="Times New Roman"/>
+                            <w:sz w:val="24"/>
+                            <w:szCs w:val="24"/>
+                            <w:lang w:val="id-ID"/>
+                          </w:rPr>
+                          <m:t>ζ</m:t>
+                        </m:r>
+                        <m:d>
+                          <m:dPr>
+                            <m:begChr m:val="{"/>
+                            <m:endChr m:val="}"/>
+                            <m:ctrlPr>
+                              <w:rPr>
+                                <w:rFonts w:ascii="Cambria Math" w:hAnsi="Cambria Math" w:cs="Times New Roman"/>
+                                <w:i/>
+                                <w:sz w:val="24"/>
+                                <w:szCs w:val="24"/>
+                              </w:rPr>
+                            </m:ctrlPr>
+                          </m:dPr>
+                          <m:e>
+                            <m:r>
+                              <w:rPr>
+                                <w:rFonts w:ascii="Cambria Math" w:hAnsi="Cambria Math" w:cs="Times New Roman"/>
+                                <w:sz w:val="24"/>
+                                <w:szCs w:val="24"/>
+                                <w:lang w:val="id-ID"/>
+                              </w:rPr>
+                              <m:t>s</m:t>
+                            </m:r>
+                          </m:e>
+                        </m:d>
+                        <m:r>
+                          <w:rPr>
+                            <w:rFonts w:ascii="Cambria Math" w:hAnsi="Cambria Math" w:cs="Times New Roman"/>
+                            <w:sz w:val="24"/>
+                            <w:szCs w:val="24"/>
+                            <w:lang w:val="id-ID"/>
+                          </w:rPr>
+                          <m:t xml:space="preserve"> = </m:t>
+                        </m:r>
+                        <m:d>
+                          <m:dPr>
+                            <m:begChr m:val="{"/>
+                            <m:endChr m:val="}"/>
+                            <m:ctrlPr>
+                              <w:rPr>
+                                <w:rFonts w:ascii="Cambria Math" w:hAnsi="Cambria Math" w:cs="Times New Roman"/>
+                                <w:i/>
+                                <w:sz w:val="24"/>
+                                <w:szCs w:val="24"/>
+                              </w:rPr>
+                            </m:ctrlPr>
+                          </m:dPr>
+                          <m:e>
+                            <m:r>
+                              <w:rPr>
+                                <w:rFonts w:ascii="Cambria Math" w:hAnsi="Cambria Math" w:cs="Times New Roman"/>
+                                <w:sz w:val="24"/>
+                                <w:szCs w:val="24"/>
+                                <w:lang w:val="id-ID"/>
+                              </w:rPr>
+                              <m:t xml:space="preserve"> -8,3275%</m:t>
+                            </m:r>
+                          </m:e>
+                        </m:d>
+                      </m:e>
+                    </m:d>
+                  </m:lim>
+                </m:limLow>
+              </m:fName>
+              <m:e>
+                <m:d>
+                  <m:dPr>
+                    <m:ctrlPr>
+                      <w:rPr>
+                        <w:rFonts w:ascii="Cambria Math" w:hAnsi="Cambria Math" w:cs="Times New Roman"/>
+                        <w:i/>
+                        <w:sz w:val="24"/>
+                        <w:szCs w:val="24"/>
+                      </w:rPr>
+                    </m:ctrlPr>
+                  </m:dPr>
+                  <m:e>
+                    <m:d>
+                      <m:dPr>
+                        <m:ctrlPr>
+                          <w:rPr>
+                            <w:rFonts w:ascii="Cambria Math" w:eastAsiaTheme="minorEastAsia" w:hAnsi="Cambria Math" w:cs="Times New Roman"/>
+                            <w:i/>
+                          </w:rPr>
+                        </m:ctrlPr>
+                      </m:dPr>
+                      <m:e>
+                        <m:sSup>
+                          <m:sSupPr>
+                            <m:ctrlPr>
+                              <w:rPr>
+                                <w:rFonts w:ascii="Cambria Math" w:hAnsi="Cambria Math"/>
+                                <w:i/>
+                              </w:rPr>
+                            </m:ctrlPr>
+                          </m:sSupPr>
+                          <m:e>
+                            <m:d>
+                              <m:dPr>
+                                <m:ctrlPr>
+                                  <w:rPr>
+                                    <w:rFonts w:ascii="Cambria Math" w:hAnsi="Cambria Math"/>
+                                    <w:i/>
+                                  </w:rPr>
+                                </m:ctrlPr>
+                              </m:dPr>
+                              <m:e>
+                                <m:r>
+                                  <w:rPr>
+                                    <w:rFonts w:ascii="Cambria Math" w:hAnsi="Cambria Math"/>
+                                    <w:lang w:val="id-ID"/>
+                                  </w:rPr>
+                                  <m:t>E + x</m:t>
+                                </m:r>
+                              </m:e>
+                            </m:d>
+                          </m:e>
+                          <m:sup>
+                            <m:r>
+                              <w:rPr>
+                                <w:rFonts w:ascii="Cambria Math" w:hAnsi="Cambria Math"/>
+                                <w:lang w:val="id-ID"/>
+                              </w:rPr>
+                              <m:t>n</m:t>
+                            </m:r>
+                          </m:sup>
+                        </m:sSup>
+                        <m:r>
+                          <w:rPr>
+                            <w:rFonts w:ascii="Cambria Math" w:hAnsi="Cambria Math"/>
+                            <w:lang w:val="id-ID"/>
+                          </w:rPr>
+                          <m:t xml:space="preserve"> - </m:t>
+                        </m:r>
+                        <m:sSup>
+                          <m:sSupPr>
+                            <m:ctrlPr>
+                              <w:rPr>
+                                <w:rFonts w:ascii="Cambria Math" w:eastAsiaTheme="minorEastAsia" w:hAnsi="Cambria Math" w:cs="Times New Roman"/>
+                                <w:i/>
+                              </w:rPr>
+                            </m:ctrlPr>
+                          </m:sSupPr>
+                          <m:e>
+                            <m:r>
+                              <w:rPr>
+                                <w:rFonts w:ascii="Cambria Math" w:eastAsiaTheme="minorEastAsia" w:hAnsi="Cambria Math" w:cs="Times New Roman"/>
+                                <w:lang w:val="id-ID"/>
+                              </w:rPr>
+                              <m:t>E</m:t>
+                            </m:r>
+                          </m:e>
+                          <m:sup>
+                            <m:r>
+                              <w:rPr>
+                                <w:rFonts w:ascii="Cambria Math" w:eastAsiaTheme="minorEastAsia" w:hAnsi="Cambria Math" w:cs="Times New Roman"/>
+                                <w:lang w:val="id-ID"/>
+                              </w:rPr>
+                              <m:t>n</m:t>
+                            </m:r>
+                          </m:sup>
+                        </m:sSup>
+                      </m:e>
+                    </m:d>
+                  </m:e>
+                </m:d>
+              </m:e>
+            </m:func>
+          </m:e>
+        </m:nary>
+        <m:r>
+          <w:rPr>
+            <w:rFonts w:ascii="Cambria Math" w:hAnsi="Cambria Math" w:cs="Times New Roman"/>
+            <w:sz w:val="24"/>
+            <w:szCs w:val="24"/>
+            <w:lang w:val="id-ID"/>
+          </w:rPr>
+          <m:t xml:space="preserve">= </m:t>
+        </m:r>
+        <m:nary>
+          <m:naryPr>
+            <m:chr m:val="∑"/>
+            <m:limLoc m:val="undOvr"/>
+            <m:supHide m:val="1"/>
+            <m:ctrlPr>
+              <w:rPr>
+                <w:rFonts w:ascii="Cambria Math" w:hAnsi="Cambria Math" w:cs="Times New Roman"/>
+                <w:i/>
+                <w:sz w:val="24"/>
+                <w:szCs w:val="24"/>
+              </w:rPr>
+            </m:ctrlPr>
+          </m:naryPr>
+          <m:sub>
+            <m:d>
+              <m:dPr>
+                <m:ctrlPr>
+                  <w:rPr>
+                    <w:rFonts w:ascii="Cambria Math" w:hAnsi="Cambria Math" w:cs="Times New Roman"/>
+                    <w:i/>
+                    <w:sz w:val="24"/>
+                    <w:szCs w:val="24"/>
+                  </w:rPr>
+                </m:ctrlPr>
+              </m:dPr>
+              <m:e>
+                <m:r>
+                  <w:rPr>
+                    <w:rFonts w:ascii="Cambria Math" w:hAnsi="Cambria Math" w:cs="Times New Roman"/>
+                    <w:sz w:val="24"/>
+                    <w:szCs w:val="24"/>
+                    <w:lang w:val="id-ID"/>
+                  </w:rPr>
+                  <m:t>ζ</m:t>
+                </m:r>
+                <m:d>
+                  <m:dPr>
+                    <m:begChr m:val="{"/>
+                    <m:endChr m:val="}"/>
+                    <m:ctrlPr>
+                      <w:rPr>
+                        <w:rFonts w:ascii="Cambria Math" w:hAnsi="Cambria Math" w:cs="Times New Roman"/>
+                        <w:i/>
+                        <w:sz w:val="24"/>
+                        <w:szCs w:val="24"/>
+                      </w:rPr>
+                    </m:ctrlPr>
+                  </m:dPr>
+                  <m:e>
+                    <m:r>
+                      <w:rPr>
+                        <w:rFonts w:ascii="Cambria Math" w:hAnsi="Cambria Math" w:cs="Times New Roman"/>
+                        <w:sz w:val="24"/>
+                        <w:szCs w:val="24"/>
+                        <w:lang w:val="id-ID"/>
+                      </w:rPr>
+                      <m:t>s</m:t>
+                    </m:r>
+                  </m:e>
+                </m:d>
+                <m:r>
+                  <w:rPr>
+                    <w:rFonts w:ascii="Cambria Math" w:hAnsi="Cambria Math" w:cs="Times New Roman"/>
+                    <w:sz w:val="24"/>
+                    <w:szCs w:val="24"/>
+                    <w:lang w:val="id-ID"/>
+                  </w:rPr>
+                  <m:t xml:space="preserve"> = </m:t>
+                </m:r>
+                <m:d>
+                  <m:dPr>
+                    <m:begChr m:val="{"/>
+                    <m:endChr m:val="}"/>
+                    <m:ctrlPr>
+                      <w:rPr>
+                        <w:rFonts w:ascii="Cambria Math" w:hAnsi="Cambria Math" w:cs="Times New Roman"/>
+                        <w:i/>
+                        <w:sz w:val="24"/>
+                        <w:szCs w:val="24"/>
+                      </w:rPr>
+                    </m:ctrlPr>
+                  </m:dPr>
+                  <m:e>
+                    <m:r>
+                      <w:rPr>
+                        <w:rFonts w:ascii="Cambria Math" w:hAnsi="Cambria Math" w:cs="Times New Roman"/>
+                        <w:sz w:val="24"/>
+                        <w:szCs w:val="24"/>
+                        <w:lang w:val="id-ID"/>
+                      </w:rPr>
+                      <m:t xml:space="preserve"> -8,3275%</m:t>
+                    </m:r>
+                  </m:e>
+                </m:d>
+              </m:e>
+            </m:d>
+          </m:sub>
+          <m:sup/>
+          <m:e>
+            <m:func>
+              <m:funcPr>
+                <m:ctrlPr>
+                  <w:rPr>
+                    <w:rFonts w:ascii="Cambria Math" w:hAnsi="Cambria Math" w:cs="Times New Roman"/>
+                    <w:i/>
+                    <w:sz w:val="24"/>
+                    <w:szCs w:val="24"/>
+                  </w:rPr>
+                </m:ctrlPr>
+              </m:funcPr>
+              <m:fName>
+                <m:limLow>
+                  <m:limLowPr>
+                    <m:ctrlPr>
+                      <w:rPr>
+                        <w:rFonts w:ascii="Cambria Math" w:hAnsi="Cambria Math" w:cs="Times New Roman"/>
+                        <w:i/>
+                        <w:sz w:val="24"/>
+                        <w:szCs w:val="24"/>
+                      </w:rPr>
+                    </m:ctrlPr>
+                  </m:limLowPr>
+                  <m:e>
+                    <m:r>
+                      <m:rPr>
+                        <m:sty m:val="p"/>
+                      </m:rPr>
+                      <w:rPr>
+                        <w:rFonts w:ascii="Cambria Math" w:hAnsi="Cambria Math" w:cs="Times New Roman"/>
+                        <w:sz w:val="24"/>
+                        <w:szCs w:val="24"/>
+                        <w:lang w:val="id-ID"/>
+                      </w:rPr>
+                      <m:t>lim</m:t>
+                    </m:r>
+                  </m:e>
+                  <m:lim>
+                    <m:d>
+                      <m:dPr>
+                        <m:ctrlPr>
+                          <w:rPr>
+                            <w:rFonts w:ascii="Cambria Math" w:hAnsi="Cambria Math" w:cs="Times New Roman"/>
+                            <w:i/>
+                            <w:sz w:val="24"/>
+                            <w:szCs w:val="24"/>
+                          </w:rPr>
+                        </m:ctrlPr>
+                      </m:dPr>
+                      <m:e>
+                        <m:r>
+                          <w:rPr>
+                            <w:rFonts w:ascii="Cambria Math" w:hAnsi="Cambria Math" w:cs="Times New Roman"/>
+                            <w:sz w:val="24"/>
+                            <w:szCs w:val="24"/>
+                            <w:lang w:val="id-ID"/>
+                          </w:rPr>
+                          <m:t>ζ</m:t>
+                        </m:r>
+                        <m:d>
+                          <m:dPr>
+                            <m:begChr m:val="{"/>
+                            <m:endChr m:val="}"/>
+                            <m:ctrlPr>
+                              <w:rPr>
+                                <w:rFonts w:ascii="Cambria Math" w:hAnsi="Cambria Math" w:cs="Times New Roman"/>
+                                <w:i/>
+                                <w:sz w:val="24"/>
+                                <w:szCs w:val="24"/>
+                              </w:rPr>
+                            </m:ctrlPr>
+                          </m:dPr>
+                          <m:e>
+                            <m:r>
+                              <w:rPr>
+                                <w:rFonts w:ascii="Cambria Math" w:hAnsi="Cambria Math" w:cs="Times New Roman"/>
+                                <w:sz w:val="24"/>
+                                <w:szCs w:val="24"/>
+                                <w:lang w:val="id-ID"/>
+                              </w:rPr>
+                              <m:t>s</m:t>
+                            </m:r>
+                          </m:e>
+                        </m:d>
+                        <m:r>
+                          <w:rPr>
+                            <w:rFonts w:ascii="Cambria Math" w:hAnsi="Cambria Math" w:cs="Times New Roman"/>
+                            <w:sz w:val="24"/>
+                            <w:szCs w:val="24"/>
+                            <w:lang w:val="id-ID"/>
+                          </w:rPr>
+                          <m:t xml:space="preserve"> = </m:t>
+                        </m:r>
+                        <m:d>
+                          <m:dPr>
+                            <m:begChr m:val="{"/>
+                            <m:endChr m:val="}"/>
+                            <m:ctrlPr>
+                              <w:rPr>
+                                <w:rFonts w:ascii="Cambria Math" w:hAnsi="Cambria Math" w:cs="Times New Roman"/>
+                                <w:i/>
+                                <w:sz w:val="24"/>
+                                <w:szCs w:val="24"/>
+                              </w:rPr>
+                            </m:ctrlPr>
+                          </m:dPr>
+                          <m:e>
+                            <m:r>
+                              <w:rPr>
+                                <w:rFonts w:ascii="Cambria Math" w:hAnsi="Cambria Math" w:cs="Times New Roman"/>
+                                <w:sz w:val="24"/>
+                                <w:szCs w:val="24"/>
+                                <w:lang w:val="id-ID"/>
+                              </w:rPr>
+                              <m:t xml:space="preserve"> -8,3275%</m:t>
+                            </m:r>
+                          </m:e>
+                        </m:d>
+                      </m:e>
+                    </m:d>
+                  </m:lim>
+                </m:limLow>
+              </m:fName>
+              <m:e>
+                <m:d>
+                  <m:dPr>
+                    <m:ctrlPr>
+                      <w:rPr>
+                        <w:rFonts w:ascii="Cambria Math" w:hAnsi="Cambria Math" w:cs="Times New Roman"/>
+                        <w:i/>
+                        <w:sz w:val="24"/>
+                        <w:szCs w:val="24"/>
+                      </w:rPr>
+                    </m:ctrlPr>
+                  </m:dPr>
+                  <m:e>
+                    <m:f>
+                      <m:fPr>
+                        <m:ctrlPr>
+                          <w:rPr>
+                            <w:rFonts w:ascii="Cambria Math" w:eastAsiaTheme="minorEastAsia" w:hAnsi="Cambria Math" w:cs="Times New Roman"/>
+                            <w:i/>
+                            <w:sz w:val="24"/>
+                            <w:szCs w:val="24"/>
+                          </w:rPr>
+                        </m:ctrlPr>
+                      </m:fPr>
+                      <m:num>
+                        <m:d>
+                          <m:dPr>
+                            <m:begChr m:val="{"/>
+                            <m:endChr m:val="}"/>
+                            <m:ctrlPr>
+                              <w:rPr>
+                                <w:rFonts w:ascii="Cambria Math" w:eastAsiaTheme="minorEastAsia" w:hAnsi="Cambria Math" w:cs="Times New Roman"/>
+                                <w:i/>
+                                <w:sz w:val="24"/>
+                                <w:szCs w:val="24"/>
+                              </w:rPr>
+                            </m:ctrlPr>
+                          </m:dPr>
+                          <m:e>
+                            <m:d>
+                              <m:dPr>
+                                <m:ctrlPr>
+                                  <w:rPr>
+                                    <w:rFonts w:ascii="Cambria Math" w:eastAsiaTheme="minorEastAsia" w:hAnsi="Cambria Math" w:cs="Times New Roman"/>
+                                    <w:i/>
+                                    <w:sz w:val="24"/>
+                                    <w:szCs w:val="24"/>
+                                  </w:rPr>
+                                </m:ctrlPr>
+                              </m:dPr>
+                              <m:e>
+                                <m:nary>
+                                  <m:naryPr>
+                                    <m:limLoc m:val="undOvr"/>
+                                    <m:subHide m:val="1"/>
+                                    <m:supHide m:val="1"/>
+                                    <m:ctrlPr>
+                                      <w:rPr>
+                                        <w:rFonts w:ascii="Cambria Math" w:eastAsiaTheme="minorEastAsia" w:hAnsi="Cambria Math" w:cs="Times New Roman"/>
+                                        <w:i/>
+                                        <w:sz w:val="24"/>
+                                        <w:szCs w:val="24"/>
+                                      </w:rPr>
+                                    </m:ctrlPr>
+                                  </m:naryPr>
+                                  <m:sub/>
+                                  <m:sup/>
+                                  <m:e>
+                                    <m:d>
+                                      <m:dPr>
+                                        <m:ctrlPr>
+                                          <w:rPr>
+                                            <w:rFonts w:ascii="Cambria Math" w:eastAsiaTheme="minorEastAsia" w:hAnsi="Cambria Math" w:cs="Times New Roman"/>
+                                            <w:i/>
+                                            <w:sz w:val="24"/>
+                                            <w:szCs w:val="24"/>
+                                          </w:rPr>
+                                        </m:ctrlPr>
+                                      </m:dPr>
+                                      <m:e>
+                                        <m:sSup>
+                                          <m:sSupPr>
+                                            <m:ctrlPr>
+                                              <w:rPr>
+                                                <w:rFonts w:ascii="Cambria Math" w:eastAsiaTheme="minorEastAsia" w:hAnsi="Cambria Math" w:cs="Times New Roman"/>
+                                                <w:i/>
+                                                <w:sz w:val="24"/>
+                                                <w:szCs w:val="24"/>
+                                              </w:rPr>
+                                            </m:ctrlPr>
+                                          </m:sSupPr>
+                                          <m:e>
+                                            <m:r>
+                                              <w:rPr>
+                                                <w:rFonts w:ascii="Cambria Math" w:eastAsiaTheme="minorEastAsia" w:hAnsi="Cambria Math" w:cs="Times New Roman"/>
+                                                <w:sz w:val="24"/>
+                                                <w:szCs w:val="24"/>
+                                                <w:lang w:val="id-ID"/>
+                                              </w:rPr>
+                                              <m:t>E</m:t>
+                                            </m:r>
+                                          </m:e>
+                                          <m:sup>
+                                            <m:r>
+                                              <w:rPr>
+                                                <w:rFonts w:ascii="Cambria Math" w:eastAsiaTheme="minorEastAsia" w:hAnsi="Cambria Math" w:cs="Times New Roman"/>
+                                                <w:sz w:val="24"/>
+                                                <w:szCs w:val="24"/>
+                                                <w:lang w:val="id-ID"/>
+                                              </w:rPr>
+                                              <m:t>E</m:t>
+                                            </m:r>
+                                          </m:sup>
+                                        </m:sSup>
+                                      </m:e>
+                                    </m:d>
+                                  </m:e>
+                                </m:nary>
+                                <m:r>
+                                  <w:rPr>
+                                    <w:rFonts w:ascii="Cambria Math" w:eastAsiaTheme="minorEastAsia" w:hAnsi="Cambria Math" w:cs="Times New Roman"/>
+                                    <w:sz w:val="24"/>
+                                    <w:szCs w:val="24"/>
+                                    <w:lang w:val="id-ID"/>
+                                  </w:rPr>
+                                  <m:t xml:space="preserve"> × </m:t>
+                                </m:r>
+                                <m:d>
+                                  <m:dPr>
+                                    <m:begChr m:val="{"/>
+                                    <m:endChr m:val="}"/>
+                                    <m:ctrlPr>
+                                      <w:rPr>
+                                        <w:rFonts w:ascii="Cambria Math" w:eastAsiaTheme="minorEastAsia" w:hAnsi="Cambria Math" w:cs="Times New Roman"/>
+                                        <w:i/>
+                                        <w:sz w:val="24"/>
+                                        <w:szCs w:val="24"/>
+                                      </w:rPr>
+                                    </m:ctrlPr>
+                                  </m:dPr>
+                                  <m:e>
+                                    <m:f>
+                                      <m:fPr>
+                                        <m:ctrlPr>
+                                          <w:rPr>
+                                            <w:rFonts w:ascii="Cambria Math" w:hAnsi="Cambria Math" w:cs="Times New Roman"/>
+                                            <w:i/>
+                                            <w:sz w:val="24"/>
+                                            <w:szCs w:val="24"/>
+                                          </w:rPr>
+                                        </m:ctrlPr>
+                                      </m:fPr>
+                                      <m:num>
+                                        <m:box>
+                                          <m:boxPr>
+                                            <m:diff m:val="1"/>
+                                            <m:ctrlPr>
+                                              <w:rPr>
+                                                <w:rFonts w:ascii="Cambria Math" w:hAnsi="Cambria Math" w:cs="Times New Roman"/>
+                                                <w:i/>
+                                                <w:sz w:val="24"/>
+                                                <w:szCs w:val="24"/>
+                                              </w:rPr>
+                                            </m:ctrlPr>
+                                          </m:boxPr>
+                                          <m:e>
+                                            <m:r>
+                                              <w:rPr>
+                                                <w:rFonts w:ascii="Cambria Math" w:hAnsi="Cambria Math" w:cs="Times New Roman"/>
+                                                <w:sz w:val="24"/>
+                                                <w:szCs w:val="24"/>
+                                                <w:lang w:val="id-ID"/>
+                                              </w:rPr>
+                                              <m:t>d</m:t>
+                                            </m:r>
+                                          </m:e>
+                                        </m:box>
+                                      </m:num>
+                                      <m:den>
+                                        <m:r>
+                                          <w:rPr>
+                                            <w:rFonts w:ascii="Cambria Math" w:hAnsi="Cambria Math" w:cs="Times New Roman"/>
+                                            <w:sz w:val="24"/>
+                                            <w:szCs w:val="24"/>
+                                            <w:lang w:val="id-ID"/>
+                                          </w:rPr>
+                                          <m:t>dt</m:t>
+                                        </m:r>
+                                      </m:den>
+                                    </m:f>
+                                    <m:d>
+                                      <m:dPr>
+                                        <m:ctrlPr>
+                                          <w:rPr>
+                                            <w:rFonts w:ascii="Cambria Math" w:hAnsi="Cambria Math"/>
+                                            <w:i/>
+                                          </w:rPr>
+                                        </m:ctrlPr>
+                                      </m:dPr>
+                                      <m:e>
+                                        <m:sSup>
+                                          <m:sSupPr>
+                                            <m:ctrlPr>
+                                              <w:rPr>
+                                                <w:rFonts w:ascii="Cambria Math" w:hAnsi="Cambria Math"/>
+                                                <w:i/>
+                                              </w:rPr>
+                                            </m:ctrlPr>
+                                          </m:sSupPr>
+                                          <m:e>
+                                            <m:r>
+                                              <w:rPr>
+                                                <w:rFonts w:ascii="Cambria Math" w:hAnsi="Cambria Math"/>
+                                                <w:lang w:val="id-ID"/>
+                                              </w:rPr>
+                                              <m:t>x</m:t>
+                                            </m:r>
+                                          </m:e>
+                                          <m:sup>
+                                            <m:r>
+                                              <w:rPr>
+                                                <w:rFonts w:ascii="Cambria Math" w:hAnsi="Cambria Math"/>
+                                                <w:lang w:val="id-ID"/>
+                                              </w:rPr>
+                                              <m:t>n</m:t>
+                                            </m:r>
+                                          </m:sup>
+                                        </m:sSup>
+                                        <m:r>
+                                          <w:rPr>
+                                            <w:rFonts w:ascii="Cambria Math" w:hAnsi="Cambria Math"/>
+                                            <w:lang w:val="id-ID"/>
+                                          </w:rPr>
+                                          <m:t xml:space="preserve"> + </m:t>
+                                        </m:r>
+                                        <m:d>
+                                          <m:dPr>
+                                            <m:begChr m:val="{"/>
+                                            <m:endChr m:val="}"/>
+                                            <m:ctrlPr>
+                                              <w:rPr>
+                                                <w:rFonts w:ascii="Cambria Math" w:hAnsi="Cambria Math"/>
+                                                <w:i/>
+                                              </w:rPr>
+                                            </m:ctrlPr>
+                                          </m:dPr>
+                                          <m:e>
+                                            <m:r>
+                                              <w:rPr>
+                                                <w:rFonts w:ascii="Cambria Math" w:hAnsi="Cambria Math"/>
+                                                <w:lang w:val="id-ID"/>
+                                              </w:rPr>
+                                              <m:t>x × E × n</m:t>
+                                            </m:r>
+                                          </m:e>
+                                        </m:d>
+                                        <m:r>
+                                          <w:rPr>
+                                            <w:rFonts w:ascii="Cambria Math" w:hAnsi="Cambria Math"/>
+                                            <w:lang w:val="id-ID"/>
+                                          </w:rPr>
+                                          <m:t xml:space="preserve"> - </m:t>
+                                        </m:r>
+                                        <m:sSup>
+                                          <m:sSupPr>
+                                            <m:ctrlPr>
+                                              <w:rPr>
+                                                <w:rFonts w:ascii="Cambria Math" w:hAnsi="Cambria Math"/>
+                                                <w:i/>
+                                              </w:rPr>
+                                            </m:ctrlPr>
+                                          </m:sSupPr>
+                                          <m:e>
+                                            <m:d>
+                                              <m:dPr>
+                                                <m:begChr m:val="{"/>
+                                                <m:endChr m:val="}"/>
+                                                <m:ctrlPr>
+                                                  <w:rPr>
+                                                    <w:rFonts w:ascii="Cambria Math" w:hAnsi="Cambria Math"/>
+                                                    <w:i/>
+                                                  </w:rPr>
+                                                </m:ctrlPr>
+                                              </m:dPr>
+                                              <m:e>
+                                                <m:r>
+                                                  <w:rPr>
+                                                    <w:rFonts w:ascii="Cambria Math" w:hAnsi="Cambria Math"/>
+                                                    <w:lang w:val="id-ID"/>
+                                                  </w:rPr>
+                                                  <m:t>E × x</m:t>
+                                                </m:r>
+                                              </m:e>
+                                            </m:d>
+                                          </m:e>
+                                          <m:sup>
+                                            <m:d>
+                                              <m:dPr>
+                                                <m:ctrlPr>
+                                                  <w:rPr>
+                                                    <w:rFonts w:ascii="Cambria Math" w:hAnsi="Cambria Math"/>
+                                                    <w:i/>
+                                                  </w:rPr>
+                                                </m:ctrlPr>
+                                              </m:dPr>
+                                              <m:e>
+                                                <m:r>
+                                                  <w:rPr>
+                                                    <w:rFonts w:ascii="Cambria Math" w:hAnsi="Cambria Math"/>
+                                                    <w:lang w:val="id-ID"/>
+                                                  </w:rPr>
+                                                  <m:t>n - 1</m:t>
+                                                </m:r>
+                                              </m:e>
+                                            </m:d>
+                                          </m:sup>
+                                        </m:sSup>
+                                        <m:r>
+                                          <w:rPr>
+                                            <w:rFonts w:ascii="Cambria Math" w:hAnsi="Cambria Math"/>
+                                            <w:lang w:val="id-ID"/>
+                                          </w:rPr>
+                                          <m:t xml:space="preserve"> + </m:t>
+                                        </m:r>
+                                        <m:sSup>
+                                          <m:sSupPr>
+                                            <m:ctrlPr>
+                                              <w:rPr>
+                                                <w:rFonts w:ascii="Cambria Math" w:hAnsi="Cambria Math"/>
+                                                <w:i/>
+                                              </w:rPr>
+                                            </m:ctrlPr>
+                                          </m:sSupPr>
+                                          <m:e>
+                                            <m:r>
+                                              <w:rPr>
+                                                <w:rFonts w:ascii="Cambria Math" w:hAnsi="Cambria Math"/>
+                                                <w:lang w:val="id-ID"/>
+                                              </w:rPr>
+                                              <m:t>E</m:t>
+                                            </m:r>
+                                          </m:e>
+                                          <m:sup>
+                                            <m:d>
+                                              <m:dPr>
+                                                <m:ctrlPr>
+                                                  <w:rPr>
+                                                    <w:rFonts w:ascii="Cambria Math" w:hAnsi="Cambria Math"/>
+                                                    <w:i/>
+                                                  </w:rPr>
+                                                </m:ctrlPr>
+                                              </m:dPr>
+                                              <m:e>
+                                                <m:d>
+                                                  <m:dPr>
+                                                    <m:ctrlPr>
+                                                      <w:rPr>
+                                                        <w:rFonts w:ascii="Cambria Math" w:hAnsi="Cambria Math"/>
+                                                        <w:i/>
+                                                      </w:rPr>
+                                                    </m:ctrlPr>
+                                                  </m:dPr>
+                                                  <m:e>
+                                                    <m:r>
+                                                      <w:rPr>
+                                                        <w:rFonts w:ascii="Cambria Math" w:hAnsi="Cambria Math"/>
+                                                        <w:lang w:val="id-ID"/>
+                                                      </w:rPr>
+                                                      <m:t>2 × n</m:t>
+                                                    </m:r>
+                                                  </m:e>
+                                                </m:d>
+                                                <m:r>
+                                                  <w:rPr>
+                                                    <w:rFonts w:ascii="Cambria Math" w:hAnsi="Cambria Math"/>
+                                                    <w:lang w:val="id-ID"/>
+                                                  </w:rPr>
+                                                  <m:t xml:space="preserve"> - 1</m:t>
+                                                </m:r>
+                                              </m:e>
+                                            </m:d>
+                                          </m:sup>
+                                        </m:sSup>
+                                      </m:e>
+                                    </m:d>
+                                  </m:e>
+                                </m:d>
+                              </m:e>
+                            </m:d>
+                            <m:r>
+                              <w:rPr>
+                                <w:rFonts w:ascii="Cambria Math" w:eastAsiaTheme="minorEastAsia" w:hAnsi="Cambria Math" w:cs="Times New Roman"/>
+                                <w:sz w:val="24"/>
+                                <w:szCs w:val="24"/>
+                                <w:lang w:val="id-ID"/>
+                              </w:rPr>
+                              <m:t xml:space="preserve">- </m:t>
+                            </m:r>
+                            <m:nary>
+                              <m:naryPr>
+                                <m:limLoc m:val="undOvr"/>
+                                <m:subHide m:val="1"/>
+                                <m:supHide m:val="1"/>
+                                <m:ctrlPr>
+                                  <w:rPr>
+                                    <w:rFonts w:ascii="Cambria Math" w:eastAsiaTheme="minorEastAsia" w:hAnsi="Cambria Math" w:cs="Times New Roman"/>
+                                    <w:i/>
+                                    <w:sz w:val="24"/>
+                                    <w:szCs w:val="24"/>
+                                  </w:rPr>
+                                </m:ctrlPr>
+                              </m:naryPr>
+                              <m:sub/>
+                              <m:sup/>
+                              <m:e>
+                                <m:d>
+                                  <m:dPr>
+                                    <m:ctrlPr>
+                                      <w:rPr>
+                                        <w:rFonts w:ascii="Cambria Math" w:eastAsiaTheme="minorEastAsia" w:hAnsi="Cambria Math" w:cs="Times New Roman"/>
+                                        <w:i/>
+                                        <w:sz w:val="24"/>
+                                        <w:szCs w:val="24"/>
+                                      </w:rPr>
+                                    </m:ctrlPr>
+                                  </m:dPr>
+                                  <m:e>
+                                    <m:sSup>
+                                      <m:sSupPr>
+                                        <m:ctrlPr>
+                                          <w:rPr>
+                                            <w:rFonts w:ascii="Cambria Math" w:eastAsiaTheme="minorEastAsia" w:hAnsi="Cambria Math" w:cs="Times New Roman"/>
+                                            <w:i/>
+                                            <w:sz w:val="24"/>
+                                            <w:szCs w:val="24"/>
+                                          </w:rPr>
+                                        </m:ctrlPr>
+                                      </m:sSupPr>
+                                      <m:e>
+                                        <m:r>
+                                          <w:rPr>
+                                            <w:rFonts w:ascii="Cambria Math" w:eastAsiaTheme="minorEastAsia" w:hAnsi="Cambria Math" w:cs="Times New Roman"/>
+                                            <w:sz w:val="24"/>
+                                            <w:szCs w:val="24"/>
+                                            <w:lang w:val="id-ID"/>
+                                          </w:rPr>
+                                          <m:t>E</m:t>
+                                        </m:r>
+                                      </m:e>
+                                      <m:sup>
+                                        <m:r>
+                                          <w:rPr>
+                                            <w:rFonts w:ascii="Cambria Math" w:eastAsiaTheme="minorEastAsia" w:hAnsi="Cambria Math" w:cs="Times New Roman"/>
+                                            <w:sz w:val="24"/>
+                                            <w:szCs w:val="24"/>
+                                            <w:lang w:val="id-ID"/>
+                                          </w:rPr>
+                                          <m:t>E</m:t>
+                                        </m:r>
+                                      </m:sup>
+                                    </m:sSup>
+                                  </m:e>
+                                </m:d>
+                              </m:e>
+                            </m:nary>
+                          </m:e>
+                        </m:d>
+                      </m:num>
+                      <m:den>
+                        <m:d>
+                          <m:dPr>
+                            <m:begChr m:val="{"/>
+                            <m:endChr m:val="}"/>
+                            <m:ctrlPr>
+                              <w:rPr>
+                                <w:rFonts w:ascii="Cambria Math" w:eastAsiaTheme="minorEastAsia" w:hAnsi="Cambria Math" w:cs="Times New Roman"/>
+                                <w:i/>
+                                <w:sz w:val="24"/>
+                                <w:szCs w:val="24"/>
+                              </w:rPr>
+                            </m:ctrlPr>
+                          </m:dPr>
+                          <m:e>
+                            <m:f>
+                              <m:fPr>
+                                <m:ctrlPr>
+                                  <w:rPr>
+                                    <w:rFonts w:ascii="Cambria Math" w:hAnsi="Cambria Math" w:cs="Times New Roman"/>
+                                    <w:i/>
+                                    <w:sz w:val="24"/>
+                                    <w:szCs w:val="24"/>
+                                  </w:rPr>
+                                </m:ctrlPr>
+                              </m:fPr>
+                              <m:num>
+                                <m:box>
+                                  <m:boxPr>
+                                    <m:diff m:val="1"/>
+                                    <m:ctrlPr>
+                                      <w:rPr>
+                                        <w:rFonts w:ascii="Cambria Math" w:hAnsi="Cambria Math" w:cs="Times New Roman"/>
+                                        <w:i/>
+                                        <w:sz w:val="24"/>
+                                        <w:szCs w:val="24"/>
+                                      </w:rPr>
+                                    </m:ctrlPr>
+                                  </m:boxPr>
+                                  <m:e>
+                                    <m:r>
+                                      <w:rPr>
+                                        <w:rFonts w:ascii="Cambria Math" w:hAnsi="Cambria Math" w:cs="Times New Roman"/>
+                                        <w:sz w:val="24"/>
+                                        <w:szCs w:val="24"/>
+                                        <w:lang w:val="id-ID"/>
+                                      </w:rPr>
+                                      <m:t>d</m:t>
+                                    </m:r>
+                                  </m:e>
+                                </m:box>
+                              </m:num>
+                              <m:den>
+                                <m:r>
+                                  <w:rPr>
+                                    <w:rFonts w:ascii="Cambria Math" w:hAnsi="Cambria Math" w:cs="Times New Roman"/>
+                                    <w:sz w:val="24"/>
+                                    <w:szCs w:val="24"/>
+                                    <w:lang w:val="id-ID"/>
+                                  </w:rPr>
+                                  <m:t>dt</m:t>
+                                </m:r>
+                              </m:den>
+                            </m:f>
+                            <m:d>
+                              <m:dPr>
+                                <m:ctrlPr>
+                                  <w:rPr>
+                                    <w:rFonts w:ascii="Cambria Math" w:hAnsi="Cambria Math"/>
+                                    <w:i/>
+                                  </w:rPr>
+                                </m:ctrlPr>
+                              </m:dPr>
+                              <m:e>
+                                <m:sSup>
+                                  <m:sSupPr>
+                                    <m:ctrlPr>
+                                      <w:rPr>
+                                        <w:rFonts w:ascii="Cambria Math" w:hAnsi="Cambria Math"/>
+                                        <w:i/>
+                                      </w:rPr>
+                                    </m:ctrlPr>
+                                  </m:sSupPr>
+                                  <m:e>
+                                    <m:r>
+                                      <w:rPr>
+                                        <w:rFonts w:ascii="Cambria Math" w:hAnsi="Cambria Math"/>
+                                        <w:lang w:val="id-ID"/>
+                                      </w:rPr>
+                                      <m:t>x</m:t>
+                                    </m:r>
+                                  </m:e>
+                                  <m:sup>
+                                    <m:r>
+                                      <w:rPr>
+                                        <w:rFonts w:ascii="Cambria Math" w:hAnsi="Cambria Math"/>
+                                        <w:lang w:val="id-ID"/>
+                                      </w:rPr>
+                                      <m:t>n</m:t>
+                                    </m:r>
+                                  </m:sup>
+                                </m:sSup>
+                                <m:r>
+                                  <w:rPr>
+                                    <w:rFonts w:ascii="Cambria Math" w:hAnsi="Cambria Math"/>
+                                    <w:lang w:val="id-ID"/>
+                                  </w:rPr>
+                                  <m:t xml:space="preserve"> + </m:t>
+                                </m:r>
+                                <m:d>
+                                  <m:dPr>
+                                    <m:begChr m:val="{"/>
+                                    <m:endChr m:val="}"/>
+                                    <m:ctrlPr>
+                                      <w:rPr>
+                                        <w:rFonts w:ascii="Cambria Math" w:hAnsi="Cambria Math"/>
+                                        <w:i/>
+                                      </w:rPr>
+                                    </m:ctrlPr>
+                                  </m:dPr>
+                                  <m:e>
+                                    <m:r>
+                                      <w:rPr>
+                                        <w:rFonts w:ascii="Cambria Math" w:hAnsi="Cambria Math"/>
+                                        <w:lang w:val="id-ID"/>
+                                      </w:rPr>
+                                      <m:t>x × E × n</m:t>
+                                    </m:r>
+                                  </m:e>
+                                </m:d>
+                                <m:r>
+                                  <w:rPr>
+                                    <w:rFonts w:ascii="Cambria Math" w:hAnsi="Cambria Math"/>
+                                    <w:lang w:val="id-ID"/>
+                                  </w:rPr>
+                                  <m:t xml:space="preserve"> - </m:t>
+                                </m:r>
+                                <m:sSup>
+                                  <m:sSupPr>
+                                    <m:ctrlPr>
+                                      <w:rPr>
+                                        <w:rFonts w:ascii="Cambria Math" w:hAnsi="Cambria Math"/>
+                                        <w:i/>
+                                      </w:rPr>
+                                    </m:ctrlPr>
+                                  </m:sSupPr>
+                                  <m:e>
+                                    <m:d>
+                                      <m:dPr>
+                                        <m:begChr m:val="{"/>
+                                        <m:endChr m:val="}"/>
+                                        <m:ctrlPr>
+                                          <w:rPr>
+                                            <w:rFonts w:ascii="Cambria Math" w:hAnsi="Cambria Math"/>
+                                            <w:i/>
+                                          </w:rPr>
+                                        </m:ctrlPr>
+                                      </m:dPr>
+                                      <m:e>
+                                        <m:r>
+                                          <w:rPr>
+                                            <w:rFonts w:ascii="Cambria Math" w:hAnsi="Cambria Math"/>
+                                            <w:lang w:val="id-ID"/>
+                                          </w:rPr>
+                                          <m:t>E × x</m:t>
+                                        </m:r>
+                                      </m:e>
+                                    </m:d>
+                                  </m:e>
+                                  <m:sup>
+                                    <m:d>
+                                      <m:dPr>
+                                        <m:ctrlPr>
+                                          <w:rPr>
+                                            <w:rFonts w:ascii="Cambria Math" w:hAnsi="Cambria Math"/>
+                                            <w:i/>
+                                          </w:rPr>
+                                        </m:ctrlPr>
+                                      </m:dPr>
+                                      <m:e>
+                                        <m:r>
+                                          <w:rPr>
+                                            <w:rFonts w:ascii="Cambria Math" w:hAnsi="Cambria Math"/>
+                                            <w:lang w:val="id-ID"/>
+                                          </w:rPr>
+                                          <m:t>n - 1</m:t>
+                                        </m:r>
+                                      </m:e>
+                                    </m:d>
+                                  </m:sup>
+                                </m:sSup>
+                                <m:r>
+                                  <w:rPr>
+                                    <w:rFonts w:ascii="Cambria Math" w:hAnsi="Cambria Math"/>
+                                    <w:lang w:val="id-ID"/>
+                                  </w:rPr>
+                                  <m:t xml:space="preserve"> + </m:t>
+                                </m:r>
+                                <m:sSup>
+                                  <m:sSupPr>
+                                    <m:ctrlPr>
+                                      <w:rPr>
+                                        <w:rFonts w:ascii="Cambria Math" w:hAnsi="Cambria Math"/>
+                                        <w:i/>
+                                      </w:rPr>
+                                    </m:ctrlPr>
+                                  </m:sSupPr>
+                                  <m:e>
+                                    <m:r>
+                                      <w:rPr>
+                                        <w:rFonts w:ascii="Cambria Math" w:hAnsi="Cambria Math"/>
+                                        <w:lang w:val="id-ID"/>
+                                      </w:rPr>
+                                      <m:t>E</m:t>
+                                    </m:r>
+                                  </m:e>
+                                  <m:sup>
+                                    <m:d>
+                                      <m:dPr>
+                                        <m:ctrlPr>
+                                          <w:rPr>
+                                            <w:rFonts w:ascii="Cambria Math" w:hAnsi="Cambria Math"/>
+                                            <w:i/>
+                                          </w:rPr>
+                                        </m:ctrlPr>
+                                      </m:dPr>
+                                      <m:e>
+                                        <m:d>
+                                          <m:dPr>
+                                            <m:ctrlPr>
+                                              <w:rPr>
+                                                <w:rFonts w:ascii="Cambria Math" w:hAnsi="Cambria Math"/>
+                                                <w:i/>
+                                              </w:rPr>
+                                            </m:ctrlPr>
+                                          </m:dPr>
+                                          <m:e>
+                                            <m:r>
+                                              <w:rPr>
+                                                <w:rFonts w:ascii="Cambria Math" w:hAnsi="Cambria Math"/>
+                                                <w:lang w:val="id-ID"/>
+                                              </w:rPr>
+                                              <m:t>2 × n</m:t>
+                                            </m:r>
+                                          </m:e>
+                                        </m:d>
+                                        <m:r>
+                                          <w:rPr>
+                                            <w:rFonts w:ascii="Cambria Math" w:hAnsi="Cambria Math"/>
+                                            <w:lang w:val="id-ID"/>
+                                          </w:rPr>
+                                          <m:t xml:space="preserve"> - 1</m:t>
+                                        </m:r>
+                                      </m:e>
+                                    </m:d>
+                                  </m:sup>
+                                </m:sSup>
+                              </m:e>
+                            </m:d>
+                          </m:e>
+                        </m:d>
+                      </m:den>
+                    </m:f>
+                  </m:e>
+                </m:d>
+              </m:e>
+            </m:func>
+          </m:e>
+        </m:nary>
+      </m:oMath>
+      <w:r>
+        <w:rPr>
+          <w:rFonts w:ascii="Times New Roman" w:hAnsi="Times New Roman" w:cs="Times New Roman"/>
+          <w:sz w:val="24"/>
+          <w:szCs w:val="24"/>
+          <w:lang w:val="id-ID"/>
+        </w:rPr>
+        <w:t xml:space="preserve"> </w:t>
+      </w:r>
     </w:p>
     <w:p>
       <w:pPr>
         <w:spacing w:line="360" w:lineRule="auto"/>
         <w:jc w:val="center"/>
+        <w:rPr>
+          <w:lang w:val="id-ID"/>
+        </w:rPr>
       </w:pPr>
     </w:p>
     <w:sectPr>
@@ -4641,7 +4707,7 @@
     </w:rPrDefault>
     <w:pPrDefault>
       <w:pPr>
-        <w:spacing w:after="160" w:line="278" w:lineRule="auto"/>
+        <w:spacing w:after="80"/>
       </w:pPr>
     </w:pPrDefault>
   </w:docDefaults>
@@ -5027,9 +5093,6 @@
     <w:name w:val="Normal"/>
     <w:qFormat/>
     <w:rsid w:val="00ED752D"/>
-    <w:pPr>
-      <w:spacing w:line="259" w:lineRule="auto"/>
-    </w:pPr>
     <w:rPr>
       <w:rFonts w:eastAsiaTheme="minorHAnsi"/>
       <w:kern w:val="0"/>
@@ -5050,17 +5113,14 @@
     <w:pPr>
       <w:keepNext/>
       <w:keepLines/>
-      <w:spacing w:before="360" w:after="80" w:line="278" w:lineRule="auto"/>
+      <w:spacing w:before="360"/>
       <w:outlineLvl w:val="0"/>
     </w:pPr>
     <w:rPr>
       <w:rFonts w:asciiTheme="majorHAnsi" w:eastAsiaTheme="majorEastAsia" w:hAnsiTheme="majorHAnsi" w:cstheme="majorBidi"/>
       <w:color w:val="0F4761" w:themeColor="accent1" w:themeShade="BF"/>
-      <w:kern w:val="2"/>
       <w:sz w:val="40"/>
       <w:szCs w:val="40"/>
-      <w:lang w:val="id-ID" w:eastAsia="zh-CN"/>
-      <w14:ligatures w14:val="standardContextual"/>
     </w:rPr>
   </w:style>
   <w:style w:type="paragraph" w:styleId="Judul2">
@@ -5076,17 +5136,14 @@
     <w:pPr>
       <w:keepNext/>
       <w:keepLines/>
-      <w:spacing w:before="160" w:after="80" w:line="278" w:lineRule="auto"/>
+      <w:spacing w:before="160"/>
       <w:outlineLvl w:val="1"/>
     </w:pPr>
     <w:rPr>
       <w:rFonts w:asciiTheme="majorHAnsi" w:eastAsiaTheme="majorEastAsia" w:hAnsiTheme="majorHAnsi" w:cstheme="majorBidi"/>
       <w:color w:val="0F4761" w:themeColor="accent1" w:themeShade="BF"/>
-      <w:kern w:val="2"/>
       <w:sz w:val="32"/>
       <w:szCs w:val="32"/>
-      <w:lang w:val="id-ID" w:eastAsia="zh-CN"/>
-      <w14:ligatures w14:val="standardContextual"/>
     </w:rPr>
   </w:style>
   <w:style w:type="paragraph" w:styleId="Judul3">
@@ -5102,17 +5159,14 @@
     <w:pPr>
       <w:keepNext/>
       <w:keepLines/>
-      <w:spacing w:before="160" w:after="80" w:line="278" w:lineRule="auto"/>
+      <w:spacing w:before="160"/>
       <w:outlineLvl w:val="2"/>
     </w:pPr>
     <w:rPr>
       <w:rFonts w:eastAsiaTheme="majorEastAsia" w:cstheme="majorBidi"/>
       <w:color w:val="0F4761" w:themeColor="accent1" w:themeShade="BF"/>
-      <w:kern w:val="2"/>
       <w:sz w:val="28"/>
       <w:szCs w:val="28"/>
-      <w:lang w:val="id-ID" w:eastAsia="zh-CN"/>
-      <w14:ligatures w14:val="standardContextual"/>
     </w:rPr>
   </w:style>
   <w:style w:type="paragraph" w:styleId="Judul4">
@@ -5128,7 +5182,7 @@
     <w:pPr>
       <w:keepNext/>
       <w:keepLines/>
-      <w:spacing w:before="80" w:after="40" w:line="278" w:lineRule="auto"/>
+      <w:spacing w:before="80" w:after="40"/>
       <w:outlineLvl w:val="3"/>
     </w:pPr>
     <w:rPr>
@@ -5136,11 +5190,6 @@
       <w:i/>
       <w:iCs/>
       <w:color w:val="0F4761" w:themeColor="accent1" w:themeShade="BF"/>
-      <w:kern w:val="2"/>
-      <w:sz w:val="24"/>
-      <w:szCs w:val="24"/>
-      <w:lang w:val="id-ID" w:eastAsia="zh-CN"/>
-      <w14:ligatures w14:val="standardContextual"/>
     </w:rPr>
   </w:style>
   <w:style w:type="paragraph" w:styleId="Judul5">
@@ -5156,17 +5205,12 @@
     <w:pPr>
       <w:keepNext/>
       <w:keepLines/>
-      <w:spacing w:before="80" w:after="40" w:line="278" w:lineRule="auto"/>
+      <w:spacing w:before="80" w:after="40"/>
       <w:outlineLvl w:val="4"/>
     </w:pPr>
     <w:rPr>
       <w:rFonts w:eastAsiaTheme="majorEastAsia" w:cstheme="majorBidi"/>
       <w:color w:val="0F4761" w:themeColor="accent1" w:themeShade="BF"/>
-      <w:kern w:val="2"/>
-      <w:sz w:val="24"/>
-      <w:szCs w:val="24"/>
-      <w:lang w:val="id-ID" w:eastAsia="zh-CN"/>
-      <w14:ligatures w14:val="standardContextual"/>
     </w:rPr>
   </w:style>
   <w:style w:type="paragraph" w:styleId="Judul6">
@@ -5182,7 +5226,7 @@
     <w:pPr>
       <w:keepNext/>
       <w:keepLines/>
-      <w:spacing w:before="40" w:after="0" w:line="278" w:lineRule="auto"/>
+      <w:spacing w:before="40" w:after="0"/>
       <w:outlineLvl w:val="5"/>
     </w:pPr>
     <w:rPr>
@@ -5190,11 +5234,6 @@
       <w:i/>
       <w:iCs/>
       <w:color w:val="595959" w:themeColor="text1" w:themeTint="A6"/>
-      <w:kern w:val="2"/>
-      <w:sz w:val="24"/>
-      <w:szCs w:val="24"/>
-      <w:lang w:val="id-ID" w:eastAsia="zh-CN"/>
-      <w14:ligatures w14:val="standardContextual"/>
     </w:rPr>
   </w:style>
   <w:style w:type="paragraph" w:styleId="Judul7">
@@ -5210,17 +5249,12 @@
     <w:pPr>
       <w:keepNext/>
       <w:keepLines/>
-      <w:spacing w:before="40" w:after="0" w:line="278" w:lineRule="auto"/>
+      <w:spacing w:before="40" w:after="0"/>
       <w:outlineLvl w:val="6"/>
     </w:pPr>
     <w:rPr>
       <w:rFonts w:eastAsiaTheme="majorEastAsia" w:cstheme="majorBidi"/>
       <w:color w:val="595959" w:themeColor="text1" w:themeTint="A6"/>
-      <w:kern w:val="2"/>
-      <w:sz w:val="24"/>
-      <w:szCs w:val="24"/>
-      <w:lang w:val="id-ID" w:eastAsia="zh-CN"/>
-      <w14:ligatures w14:val="standardContextual"/>
     </w:rPr>
   </w:style>
   <w:style w:type="paragraph" w:styleId="Judul8">
@@ -5236,7 +5270,7 @@
     <w:pPr>
       <w:keepNext/>
       <w:keepLines/>
-      <w:spacing w:after="0" w:line="278" w:lineRule="auto"/>
+      <w:spacing w:after="0"/>
       <w:outlineLvl w:val="7"/>
     </w:pPr>
     <w:rPr>
@@ -5244,11 +5278,6 @@
       <w:i/>
       <w:iCs/>
       <w:color w:val="272727" w:themeColor="text1" w:themeTint="D8"/>
-      <w:kern w:val="2"/>
-      <w:sz w:val="24"/>
-      <w:szCs w:val="24"/>
-      <w:lang w:val="id-ID" w:eastAsia="zh-CN"/>
-      <w14:ligatures w14:val="standardContextual"/>
     </w:rPr>
   </w:style>
   <w:style w:type="paragraph" w:styleId="Judul9">
@@ -5264,17 +5293,12 @@
     <w:pPr>
       <w:keepNext/>
       <w:keepLines/>
-      <w:spacing w:after="0" w:line="278" w:lineRule="auto"/>
+      <w:spacing w:after="0"/>
       <w:outlineLvl w:val="8"/>
     </w:pPr>
     <w:rPr>
       <w:rFonts w:eastAsiaTheme="majorEastAsia" w:cstheme="majorBidi"/>
       <w:color w:val="272727" w:themeColor="text1" w:themeTint="D8"/>
-      <w:kern w:val="2"/>
-      <w:sz w:val="24"/>
-      <w:szCs w:val="24"/>
-      <w:lang w:val="id-ID" w:eastAsia="zh-CN"/>
-      <w14:ligatures w14:val="standardContextual"/>
     </w:rPr>
   </w:style>
   <w:style w:type="character" w:default="1" w:styleId="FontParagrafDefault">
@@ -5432,7 +5456,6 @@
     <w:qFormat/>
     <w:rsid w:val="00ED752D"/>
     <w:pPr>
-      <w:spacing w:after="80" w:line="240" w:lineRule="auto"/>
       <w:contextualSpacing/>
     </w:pPr>
     <w:rPr>
@@ -5441,8 +5464,6 @@
       <w:kern w:val="28"/>
       <w:sz w:val="56"/>
       <w:szCs w:val="56"/>
-      <w:lang w:val="id-ID" w:eastAsia="zh-CN"/>
-      <w14:ligatures w14:val="standardContextual"/>
     </w:rPr>
   </w:style>
   <w:style w:type="character" w:customStyle="1" w:styleId="JudulKAR">
@@ -5471,17 +5492,13 @@
       <w:numPr>
         <w:ilvl w:val="1"/>
       </w:numPr>
-      <w:spacing w:line="278" w:lineRule="auto"/>
     </w:pPr>
     <w:rPr>
       <w:rFonts w:eastAsiaTheme="majorEastAsia" w:cstheme="majorBidi"/>
       <w:color w:val="595959" w:themeColor="text1" w:themeTint="A6"/>
       <w:spacing w:val="15"/>
-      <w:kern w:val="2"/>
       <w:sz w:val="28"/>
       <w:szCs w:val="28"/>
-      <w:lang w:val="id-ID" w:eastAsia="zh-CN"/>
-      <w14:ligatures w14:val="standardContextual"/>
     </w:rPr>
   </w:style>
   <w:style w:type="character" w:customStyle="1" w:styleId="SubjudulKAR">
@@ -5507,19 +5524,13 @@
     <w:qFormat/>
     <w:rsid w:val="00ED752D"/>
     <w:pPr>
-      <w:spacing w:before="160" w:line="278" w:lineRule="auto"/>
+      <w:spacing w:before="160"/>
       <w:jc w:val="center"/>
     </w:pPr>
     <w:rPr>
-      <w:rFonts w:eastAsiaTheme="minorEastAsia"/>
       <w:i/>
       <w:iCs/>
       <w:color w:val="404040" w:themeColor="text1" w:themeTint="BF"/>
-      <w:kern w:val="2"/>
-      <w:sz w:val="24"/>
-      <w:szCs w:val="24"/>
-      <w:lang w:val="id-ID" w:eastAsia="zh-CN"/>
-      <w14:ligatures w14:val="standardContextual"/>
     </w:rPr>
   </w:style>
   <w:style w:type="character" w:customStyle="1" w:styleId="KutipanKAR">
@@ -5541,18 +5552,9 @@
     <w:qFormat/>
     <w:rsid w:val="00ED752D"/>
     <w:pPr>
-      <w:spacing w:line="278" w:lineRule="auto"/>
       <w:ind w:left="720"/>
       <w:contextualSpacing/>
     </w:pPr>
-    <w:rPr>
-      <w:rFonts w:eastAsiaTheme="minorEastAsia"/>
-      <w:kern w:val="2"/>
-      <w:sz w:val="24"/>
-      <w:szCs w:val="24"/>
-      <w:lang w:val="id-ID" w:eastAsia="zh-CN"/>
-      <w14:ligatures w14:val="standardContextual"/>
-    </w:rPr>
   </w:style>
   <w:style w:type="character" w:styleId="PenekananKeras">
     <w:name w:val="Intense Emphasis"/>
@@ -5579,20 +5581,14 @@
         <w:top w:val="single" w:sz="4" w:space="10" w:color="0F4761" w:themeColor="accent1" w:themeShade="BF"/>
         <w:bottom w:val="single" w:sz="4" w:space="10" w:color="0F4761" w:themeColor="accent1" w:themeShade="BF"/>
       </w:pBdr>
-      <w:spacing w:before="360" w:after="360" w:line="278" w:lineRule="auto"/>
+      <w:spacing w:before="360" w:after="360"/>
       <w:ind w:left="864" w:right="864"/>
       <w:jc w:val="center"/>
     </w:pPr>
     <w:rPr>
-      <w:rFonts w:eastAsiaTheme="minorEastAsia"/>
       <w:i/>
       <w:iCs/>
       <w:color w:val="0F4761" w:themeColor="accent1" w:themeShade="BF"/>
-      <w:kern w:val="2"/>
-      <w:sz w:val="24"/>
-      <w:szCs w:val="24"/>
-      <w:lang w:val="id-ID" w:eastAsia="zh-CN"/>
-      <w14:ligatures w14:val="standardContextual"/>
     </w:rPr>
   </w:style>
   <w:style w:type="character" w:customStyle="1" w:styleId="KutipanyangSeringKAR">

</xml_diff>

<commit_message>
Applicated Universal Exponential Equation 4.0 for Exponential Loss Energy with Zeta Percentation | (16:47 (W.I.B[Waktu Indonesia bagian Barat]), 03/04/2026), Batam, Kepulauan Riau, Indonesia | Applicated Universal Exponential Equation 4.0 for Exponential Loss Energy with Zeta Percentation #FREEISRAEL #LONGLIVEISRAEL #1ISRAEL #PROVERBS10VERSES4 #JOHN8VERSES21 #LUCAS8VERSES15
Applicated Universal Exponential Equation 4.0 for Exponential Loss Energy with Zeta Percentation | (16:47 (W.I.B[Waktu Indonesia bagian Barat]), 03/04/2026), Batam, Kepulauan Riau, Indonesia | Applicated Universal Exponential Equation 4.0 for Exponential Loss Energy with Zeta Percentation #FREEISRAEL #LONGLIVEISRAEL #1ISRAEL #PROVERBS10VERSES4 #JOHN8VERSES21 #LUCAS8VERSES15
</commit_message>
<xml_diff>
--- a/Applicated Universal Exponential Equation 4.0 for Exponential Loss Energy with Zeta Percentation.docx
+++ b/Applicated Universal Exponential Equation 4.0 for Exponential Loss Energy with Zeta Percentation.docx
@@ -3600,93 +3600,81 @@
                     </m:ctrlPr>
                   </m:dPr>
                   <m:e>
-                    <m:d>
-                      <m:dPr>
+                    <m:sSup>
+                      <m:sSupPr>
+                        <m:ctrlPr>
+                          <w:rPr>
+                            <w:rFonts w:ascii="Cambria Math" w:hAnsi="Cambria Math"/>
+                            <w:i/>
+                          </w:rPr>
+                        </m:ctrlPr>
+                      </m:sSupPr>
+                      <m:e>
+                        <m:d>
+                          <m:dPr>
+                            <m:ctrlPr>
+                              <w:rPr>
+                                <w:rFonts w:ascii="Cambria Math" w:hAnsi="Cambria Math"/>
+                                <w:i/>
+                              </w:rPr>
+                            </m:ctrlPr>
+                          </m:dPr>
+                          <m:e>
+                            <m:r>
+                              <w:rPr>
+                                <w:rFonts w:ascii="Cambria Math" w:hAnsi="Cambria Math"/>
+                                <w:lang w:val="id-ID"/>
+                              </w:rPr>
+                              <m:t>E + x</m:t>
+                            </m:r>
+                          </m:e>
+                        </m:d>
+                      </m:e>
+                      <m:sup>
+                        <m:r>
+                          <w:rPr>
+                            <w:rFonts w:ascii="Cambria Math" w:hAnsi="Cambria Math"/>
+                            <w:lang w:val="id-ID"/>
+                          </w:rPr>
+                          <m:t>n</m:t>
+                        </m:r>
+                      </m:sup>
+                    </m:sSup>
+                    <m:r>
+                      <w:rPr>
+                        <w:rFonts w:ascii="Cambria Math" w:hAnsi="Cambria Math"/>
+                        <w:lang w:val="id-ID"/>
+                      </w:rPr>
+                      <m:t xml:space="preserve"> - </m:t>
+                    </m:r>
+                    <m:sSup>
+                      <m:sSupPr>
                         <m:ctrlPr>
                           <w:rPr>
                             <w:rFonts w:ascii="Cambria Math" w:eastAsiaTheme="minorEastAsia" w:hAnsi="Cambria Math" w:cs="Times New Roman"/>
                             <w:i/>
                           </w:rPr>
                         </m:ctrlPr>
-                      </m:dPr>
+                      </m:sSupPr>
                       <m:e>
-                        <m:sSup>
-                          <m:sSupPr>
-                            <m:ctrlPr>
-                              <w:rPr>
-                                <w:rFonts w:ascii="Cambria Math" w:hAnsi="Cambria Math"/>
-                                <w:i/>
-                              </w:rPr>
-                            </m:ctrlPr>
-                          </m:sSupPr>
-                          <m:e>
-                            <m:d>
-                              <m:dPr>
-                                <m:ctrlPr>
-                                  <w:rPr>
-                                    <w:rFonts w:ascii="Cambria Math" w:hAnsi="Cambria Math"/>
-                                    <w:i/>
-                                  </w:rPr>
-                                </m:ctrlPr>
-                              </m:dPr>
-                              <m:e>
-                                <m:r>
-                                  <w:rPr>
-                                    <w:rFonts w:ascii="Cambria Math" w:hAnsi="Cambria Math"/>
-                                    <w:lang w:val="id-ID"/>
-                                  </w:rPr>
-                                  <m:t>E + x</m:t>
-                                </m:r>
-                              </m:e>
-                            </m:d>
-                          </m:e>
-                          <m:sup>
-                            <m:r>
-                              <w:rPr>
-                                <w:rFonts w:ascii="Cambria Math" w:hAnsi="Cambria Math"/>
-                                <w:lang w:val="id-ID"/>
-                              </w:rPr>
-                              <m:t>n</m:t>
-                            </m:r>
-                          </m:sup>
-                        </m:sSup>
                         <m:r>
                           <w:rPr>
-                            <w:rFonts w:ascii="Cambria Math" w:hAnsi="Cambria Math"/>
+                            <w:rFonts w:ascii="Cambria Math" w:eastAsiaTheme="minorEastAsia" w:hAnsi="Cambria Math" w:cs="Times New Roman"/>
                             <w:lang w:val="id-ID"/>
                           </w:rPr>
-                          <m:t xml:space="preserve"> - </m:t>
+                          <m:t>E</m:t>
                         </m:r>
-                        <m:sSup>
-                          <m:sSupPr>
-                            <m:ctrlPr>
-                              <w:rPr>
-                                <w:rFonts w:ascii="Cambria Math" w:eastAsiaTheme="minorEastAsia" w:hAnsi="Cambria Math" w:cs="Times New Roman"/>
-                                <w:i/>
-                              </w:rPr>
-                            </m:ctrlPr>
-                          </m:sSupPr>
-                          <m:e>
-                            <m:r>
-                              <w:rPr>
-                                <w:rFonts w:ascii="Cambria Math" w:eastAsiaTheme="minorEastAsia" w:hAnsi="Cambria Math" w:cs="Times New Roman"/>
-                                <w:lang w:val="id-ID"/>
-                              </w:rPr>
-                              <m:t>E</m:t>
-                            </m:r>
-                          </m:e>
-                          <m:sup>
-                            <m:r>
-                              <w:rPr>
-                                <w:rFonts w:ascii="Cambria Math" w:eastAsiaTheme="minorEastAsia" w:hAnsi="Cambria Math" w:cs="Times New Roman"/>
-                                <w:lang w:val="id-ID"/>
-                              </w:rPr>
-                              <m:t>n</m:t>
-                            </m:r>
-                          </m:sup>
-                        </m:sSup>
                       </m:e>
-                    </m:d>
+                      <m:sup>
+                        <m:r>
+                          <w:rPr>
+                            <w:rFonts w:ascii="Cambria Math" w:eastAsiaTheme="minorEastAsia" w:hAnsi="Cambria Math" w:cs="Times New Roman"/>
+                            <w:lang w:val="id-ID"/>
+                          </w:rPr>
+                          <m:t>n</m:t>
+                        </m:r>
+                      </m:sup>
+                    </m:sSup>
                   </m:e>
                 </m:d>
               </m:e>

</xml_diff>

<commit_message>
Applicated Universal Exponential Equation 4.0 for Exponential Loss Energy with Zeta Percentation
Applicated Universal Exponential Equation 4.0 for Exponential Loss Energy with Zeta Percentation
</commit_message>
<xml_diff>
--- a/Applicated Universal Exponential Equation 4.0 for Exponential Loss Energy with Zeta Percentation.docx
+++ b/Applicated Universal Exponential Equation 4.0 for Exponential Loss Energy with Zeta Percentation.docx
@@ -19,18 +19,8 @@
           <w:sz w:val="24"/>
           <w:szCs w:val="24"/>
         </w:rPr>
-        <w:t xml:space="preserve">Applicated Universal Exponential Equation 4.0 for Exponential Loss Energy with Zeta </w:t>
+        <w:t>Applicated Universal Exponential Equation 4.0 for Exponential Loss Energy with Zeta Percentation</w:t>
       </w:r>
-      <w:proofErr w:type="spellStart"/>
-      <w:r>
-        <w:rPr>
-          <w:rFonts w:ascii="Times New Roman" w:eastAsiaTheme="minorEastAsia" w:hAnsi="Times New Roman" w:cs="Times New Roman"/>
-          <w:sz w:val="24"/>
-          <w:szCs w:val="24"/>
-        </w:rPr>
-        <w:t>Percentation</w:t>
-      </w:r>
-      <w:proofErr w:type="spellEnd"/>
     </w:p>
     <w:p>
       <w:pPr>
@@ -43,7 +33,6 @@
           <w:lang w:val="id-ID"/>
         </w:rPr>
       </w:pPr>
-      <w:proofErr w:type="spellStart"/>
       <w:r>
         <w:rPr>
           <w:rFonts w:ascii="Times New Roman" w:eastAsiaTheme="minorEastAsia" w:hAnsi="Times New Roman" w:cs="Times New Roman"/>
@@ -51,37 +40,7 @@
           <w:szCs w:val="24"/>
           <w:lang w:val="id-ID"/>
         </w:rPr>
-        <w:t>by</w:t>
-      </w:r>
-      <w:proofErr w:type="spellEnd"/>
-      <w:r>
-        <w:rPr>
-          <w:rFonts w:ascii="Times New Roman" w:eastAsiaTheme="minorEastAsia" w:hAnsi="Times New Roman" w:cs="Times New Roman"/>
-          <w:sz w:val="24"/>
-          <w:szCs w:val="24"/>
-          <w:lang w:val="id-ID"/>
-        </w:rPr>
-        <w:t xml:space="preserve"> : Samuel Hasiholan Omega Purba, S. </w:t>
-      </w:r>
-      <w:proofErr w:type="spellStart"/>
-      <w:r>
-        <w:rPr>
-          <w:rFonts w:ascii="Times New Roman" w:eastAsiaTheme="minorEastAsia" w:hAnsi="Times New Roman" w:cs="Times New Roman"/>
-          <w:sz w:val="24"/>
-          <w:szCs w:val="24"/>
-          <w:lang w:val="id-ID"/>
-        </w:rPr>
-        <w:t>Tr</w:t>
-      </w:r>
-      <w:proofErr w:type="spellEnd"/>
-      <w:r>
-        <w:rPr>
-          <w:rFonts w:ascii="Times New Roman" w:eastAsiaTheme="minorEastAsia" w:hAnsi="Times New Roman" w:cs="Times New Roman"/>
-          <w:sz w:val="24"/>
-          <w:szCs w:val="24"/>
-          <w:lang w:val="id-ID"/>
-        </w:rPr>
-        <w:t>. T.</w:t>
+        <w:t>by : Samuel Hasiholan Omega Purba, S. Tr. T.</w:t>
       </w:r>
     </w:p>
     <w:p>
@@ -116,7 +75,6 @@
           <w:lang w:val="id-ID"/>
         </w:rPr>
       </w:pPr>
-      <w:proofErr w:type="spellStart"/>
       <w:r>
         <w:rPr>
           <w:rFonts w:ascii="Times New Roman" w:eastAsiaTheme="minorEastAsia" w:hAnsi="Times New Roman" w:cs="Times New Roman"/>
@@ -124,17 +82,7 @@
           <w:szCs w:val="24"/>
           <w:lang w:val="id-ID"/>
         </w:rPr>
-        <w:t>Prodi</w:t>
-      </w:r>
-      <w:proofErr w:type="spellEnd"/>
-      <w:r>
-        <w:rPr>
-          <w:rFonts w:ascii="Times New Roman" w:eastAsiaTheme="minorEastAsia" w:hAnsi="Times New Roman" w:cs="Times New Roman"/>
-          <w:sz w:val="24"/>
-          <w:szCs w:val="24"/>
-          <w:lang w:val="id-ID"/>
-        </w:rPr>
-        <w:t xml:space="preserve"> Teknik Robotika dan Kecerdasan buatan</w:t>
+        <w:t>Prodi Teknik Robotika dan Kecerdasan buatan</w:t>
       </w:r>
     </w:p>
     <w:p>
@@ -4322,164 +4270,135 @@
                                       <m:dPr>
                                         <m:ctrlPr>
                                           <w:rPr>
-                                            <w:rFonts w:ascii="Cambria Math" w:hAnsi="Cambria Math"/>
+                                            <w:rFonts w:ascii="Cambria Math" w:eastAsiaTheme="minorEastAsia" w:hAnsi="Cambria Math" w:cs="Times New Roman"/>
                                             <w:i/>
+                                            <w:sz w:val="24"/>
+                                            <w:szCs w:val="24"/>
                                           </w:rPr>
                                         </m:ctrlPr>
                                       </m:dPr>
                                       <m:e>
-                                        <m:sSup>
-                                          <m:sSupPr>
+                                        <m:nary>
+                                          <m:naryPr>
+                                            <m:chr m:val="∑"/>
+                                            <m:limLoc m:val="undOvr"/>
                                             <m:ctrlPr>
                                               <w:rPr>
-                                                <w:rFonts w:ascii="Cambria Math" w:hAnsi="Cambria Math"/>
+                                                <w:rFonts w:ascii="Cambria Math" w:eastAsiaTheme="minorEastAsia" w:hAnsi="Cambria Math" w:cs="Times New Roman"/>
                                                 <w:i/>
+                                                <w:sz w:val="24"/>
+                                                <w:szCs w:val="24"/>
                                               </w:rPr>
                                             </m:ctrlPr>
-                                          </m:sSupPr>
-                                          <m:e>
-                                            <m:r>
-                                              <w:rPr>
-                                                <w:rFonts w:ascii="Cambria Math" w:hAnsi="Cambria Math"/>
-                                                <w:lang w:val="id-ID"/>
-                                              </w:rPr>
-                                              <m:t>x</m:t>
-                                            </m:r>
-                                          </m:e>
-                                          <m:sup>
-                                            <m:r>
-                                              <w:rPr>
-                                                <w:rFonts w:ascii="Cambria Math" w:hAnsi="Cambria Math"/>
-                                                <w:lang w:val="id-ID"/>
-                                              </w:rPr>
-                                              <m:t>n</m:t>
-                                            </m:r>
-                                          </m:sup>
-                                        </m:sSup>
-                                        <m:r>
-                                          <w:rPr>
-                                            <w:rFonts w:ascii="Cambria Math" w:hAnsi="Cambria Math"/>
-                                            <w:lang w:val="id-ID"/>
-                                          </w:rPr>
-                                          <m:t xml:space="preserve"> + </m:t>
-                                        </m:r>
-                                        <m:d>
-                                          <m:dPr>
-                                            <m:begChr m:val="{"/>
-                                            <m:endChr m:val="}"/>
-                                            <m:ctrlPr>
-                                              <w:rPr>
-                                                <w:rFonts w:ascii="Cambria Math" w:hAnsi="Cambria Math"/>
-                                                <w:i/>
-                                              </w:rPr>
-                                            </m:ctrlPr>
-                                          </m:dPr>
-                                          <m:e>
-                                            <m:r>
-                                              <w:rPr>
-                                                <w:rFonts w:ascii="Cambria Math" w:hAnsi="Cambria Math"/>
-                                                <w:lang w:val="id-ID"/>
-                                              </w:rPr>
-                                              <m:t>x × E × n</m:t>
-                                            </m:r>
-                                          </m:e>
-                                        </m:d>
-                                        <m:r>
-                                          <w:rPr>
-                                            <w:rFonts w:ascii="Cambria Math" w:hAnsi="Cambria Math"/>
-                                            <w:lang w:val="id-ID"/>
-                                          </w:rPr>
-                                          <m:t xml:space="preserve"> - </m:t>
-                                        </m:r>
-                                        <m:sSup>
-                                          <m:sSupPr>
-                                            <m:ctrlPr>
-                                              <w:rPr>
-                                                <w:rFonts w:ascii="Cambria Math" w:hAnsi="Cambria Math"/>
-                                                <w:i/>
-                                              </w:rPr>
-                                            </m:ctrlPr>
-                                          </m:sSupPr>
-                                          <m:e>
+                                          </m:naryPr>
+                                          <m:sub>
                                             <m:d>
                                               <m:dPr>
-                                                <m:begChr m:val="{"/>
-                                                <m:endChr m:val="}"/>
                                                 <m:ctrlPr>
                                                   <w:rPr>
-                                                    <w:rFonts w:ascii="Cambria Math" w:hAnsi="Cambria Math"/>
+                                                    <w:rFonts w:ascii="Cambria Math" w:eastAsiaTheme="minorEastAsia" w:hAnsi="Cambria Math" w:cs="Times New Roman"/>
                                                     <w:i/>
+                                                    <w:sz w:val="24"/>
+                                                    <w:szCs w:val="24"/>
                                                   </w:rPr>
                                                 </m:ctrlPr>
                                               </m:dPr>
                                               <m:e>
                                                 <m:r>
                                                   <w:rPr>
-                                                    <w:rFonts w:ascii="Cambria Math" w:hAnsi="Cambria Math"/>
+                                                    <w:rFonts w:ascii="Cambria Math" w:eastAsiaTheme="minorEastAsia" w:hAnsi="Cambria Math" w:cs="Times New Roman"/>
+                                                    <w:sz w:val="24"/>
+                                                    <w:szCs w:val="24"/>
                                                     <w:lang w:val="id-ID"/>
                                                   </w:rPr>
-                                                  <m:t>E × x</m:t>
+                                                  <m:t>i=k</m:t>
                                                 </m:r>
                                               </m:e>
                                             </m:d>
-                                          </m:e>
+                                          </m:sub>
                                           <m:sup>
+                                            <m:r>
+                                              <w:rPr>
+                                                <w:rFonts w:ascii="Cambria Math" w:eastAsiaTheme="minorEastAsia" w:hAnsi="Cambria Math" w:cs="Times New Roman"/>
+                                                <w:sz w:val="24"/>
+                                                <w:szCs w:val="24"/>
+                                                <w:lang w:val="id-ID"/>
+                                              </w:rPr>
+                                              <m:t>n</m:t>
+                                            </m:r>
+                                          </m:sup>
+                                          <m:e>
                                             <m:d>
                                               <m:dPr>
                                                 <m:ctrlPr>
                                                   <w:rPr>
-                                                    <w:rFonts w:ascii="Cambria Math" w:hAnsi="Cambria Math"/>
+                                                    <w:rFonts w:ascii="Cambria Math" w:eastAsiaTheme="minorEastAsia" w:hAnsi="Cambria Math" w:cs="Times New Roman"/>
                                                     <w:i/>
+                                                    <w:sz w:val="24"/>
+                                                    <w:szCs w:val="24"/>
                                                   </w:rPr>
                                                 </m:ctrlPr>
                                               </m:dPr>
                                               <m:e>
-                                                <m:r>
-                                                  <w:rPr>
-                                                    <w:rFonts w:ascii="Cambria Math" w:hAnsi="Cambria Math"/>
-                                                    <w:lang w:val="id-ID"/>
-                                                  </w:rPr>
-                                                  <m:t>n - 1</m:t>
-                                                </m:r>
+                                                <m:m>
+                                                  <m:mPr>
+                                                    <m:mcs>
+                                                      <m:mc>
+                                                        <m:mcPr>
+                                                          <m:count m:val="1"/>
+                                                          <m:mcJc m:val="center"/>
+                                                        </m:mcPr>
+                                                      </m:mc>
+                                                    </m:mcs>
+                                                    <m:ctrlPr>
+                                                      <w:rPr>
+                                                        <w:rFonts w:ascii="Cambria Math" w:eastAsiaTheme="minorEastAsia" w:hAnsi="Cambria Math" w:cs="Times New Roman"/>
+                                                        <w:i/>
+                                                        <w:sz w:val="24"/>
+                                                        <w:szCs w:val="24"/>
+                                                      </w:rPr>
+                                                    </m:ctrlPr>
+                                                  </m:mPr>
+                                                  <m:mr>
+                                                    <m:e>
+                                                      <m:r>
+                                                        <w:rPr>
+                                                          <w:rFonts w:ascii="Cambria Math" w:eastAsiaTheme="minorEastAsia" w:hAnsi="Cambria Math" w:cs="Times New Roman"/>
+                                                          <w:sz w:val="24"/>
+                                                          <w:szCs w:val="24"/>
+                                                          <w:lang w:val="id-ID"/>
+                                                        </w:rPr>
+                                                        <m:t>n</m:t>
+                                                      </m:r>
+                                                    </m:e>
+                                                  </m:mr>
+                                                  <m:mr>
+                                                    <m:e>
+                                                      <m:r>
+                                                        <w:rPr>
+                                                          <w:rFonts w:ascii="Cambria Math" w:eastAsiaTheme="minorEastAsia" w:hAnsi="Cambria Math" w:cs="Times New Roman"/>
+                                                          <w:sz w:val="24"/>
+                                                          <w:szCs w:val="24"/>
+                                                          <w:lang w:val="id-ID"/>
+                                                        </w:rPr>
+                                                        <m:t>i</m:t>
+                                                      </m:r>
+                                                    </m:e>
+                                                  </m:mr>
+                                                </m:m>
                                               </m:e>
                                             </m:d>
-                                          </m:sup>
-                                        </m:sSup>
-                                        <m:r>
-                                          <w:rPr>
-                                            <w:rFonts w:ascii="Cambria Math" w:hAnsi="Cambria Math"/>
-                                            <w:lang w:val="id-ID"/>
-                                          </w:rPr>
-                                          <m:t xml:space="preserve"> + </m:t>
-                                        </m:r>
-                                        <m:sSup>
-                                          <m:sSupPr>
-                                            <m:ctrlPr>
-                                              <w:rPr>
-                                                <w:rFonts w:ascii="Cambria Math" w:hAnsi="Cambria Math"/>
-                                                <w:i/>
-                                              </w:rPr>
-                                            </m:ctrlPr>
-                                          </m:sSupPr>
-                                          <m:e>
-                                            <m:r>
-                                              <w:rPr>
-                                                <w:rFonts w:ascii="Cambria Math" w:hAnsi="Cambria Math"/>
-                                                <w:lang w:val="id-ID"/>
-                                              </w:rPr>
-                                              <m:t>E</m:t>
-                                            </m:r>
-                                          </m:e>
-                                          <m:sup>
-                                            <m:d>
-                                              <m:dPr>
+                                            <m:sSup>
+                                              <m:sSupPr>
                                                 <m:ctrlPr>
                                                   <w:rPr>
-                                                    <w:rFonts w:ascii="Cambria Math" w:hAnsi="Cambria Math"/>
+                                                    <w:rFonts w:ascii="Cambria Math" w:eastAsiaTheme="minorEastAsia" w:hAnsi="Cambria Math" w:cs="Times New Roman"/>
                                                     <w:i/>
+                                                    <w:sz w:val="24"/>
+                                                    <w:szCs w:val="24"/>
                                                   </w:rPr>
                                                 </m:ctrlPr>
-                                              </m:dPr>
+                                              </m:sSupPr>
                                               <m:e>
                                                 <m:d>
                                                   <m:dPr>
@@ -4494,23 +4413,83 @@
                                                     <m:r>
                                                       <w:rPr>
                                                         <w:rFonts w:ascii="Cambria Math" w:hAnsi="Cambria Math"/>
-                                                        <w:lang w:val="id-ID"/>
                                                       </w:rPr>
-                                                      <m:t>2 × n</m:t>
+                                                      <m:t>E + x</m:t>
                                                     </m:r>
                                                   </m:e>
                                                 </m:d>
+                                              </m:e>
+                                              <m:sup>
+                                                <m:d>
+                                                  <m:dPr>
+                                                    <m:ctrlPr>
+                                                      <w:rPr>
+                                                        <w:rFonts w:ascii="Cambria Math" w:eastAsiaTheme="minorEastAsia" w:hAnsi="Cambria Math" w:cs="Times New Roman"/>
+                                                        <w:i/>
+                                                        <w:sz w:val="24"/>
+                                                        <w:szCs w:val="24"/>
+                                                      </w:rPr>
+                                                    </m:ctrlPr>
+                                                  </m:dPr>
+                                                  <m:e>
+                                                    <m:r>
+                                                      <w:rPr>
+                                                        <w:rFonts w:ascii="Cambria Math" w:eastAsiaTheme="minorEastAsia" w:hAnsi="Cambria Math" w:cs="Times New Roman"/>
+                                                        <w:sz w:val="24"/>
+                                                        <w:szCs w:val="24"/>
+                                                        <w:lang w:val="id-ID"/>
+                                                      </w:rPr>
+                                                      <m:t>k - n</m:t>
+                                                    </m:r>
+                                                  </m:e>
+                                                </m:d>
+                                              </m:sup>
+                                            </m:sSup>
+                                            <m:r>
+                                              <w:rPr>
+                                                <w:rFonts w:ascii="Cambria Math" w:eastAsiaTheme="minorEastAsia" w:hAnsi="Cambria Math" w:cs="Times New Roman"/>
+                                                <w:sz w:val="24"/>
+                                                <w:szCs w:val="24"/>
+                                                <w:lang w:val="id-ID"/>
+                                              </w:rPr>
+                                              <m:t xml:space="preserve"> </m:t>
+                                            </m:r>
+                                            <m:sSup>
+                                              <m:sSupPr>
+                                                <m:ctrlPr>
+                                                  <w:rPr>
+                                                    <w:rFonts w:ascii="Cambria Math" w:eastAsiaTheme="minorEastAsia" w:hAnsi="Cambria Math" w:cs="Times New Roman"/>
+                                                    <w:i/>
+                                                    <w:sz w:val="24"/>
+                                                    <w:szCs w:val="24"/>
+                                                  </w:rPr>
+                                                </m:ctrlPr>
+                                              </m:sSupPr>
+                                              <m:e>
                                                 <m:r>
                                                   <w:rPr>
-                                                    <w:rFonts w:ascii="Cambria Math" w:hAnsi="Cambria Math"/>
+                                                    <w:rFonts w:ascii="Cambria Math" w:eastAsiaTheme="minorEastAsia" w:hAnsi="Cambria Math" w:cs="Times New Roman"/>
+                                                    <w:sz w:val="24"/>
+                                                    <w:szCs w:val="24"/>
                                                     <w:lang w:val="id-ID"/>
                                                   </w:rPr>
-                                                  <m:t xml:space="preserve"> - 1</m:t>
+                                                  <m:t>E</m:t>
                                                 </m:r>
                                               </m:e>
-                                            </m:d>
-                                          </m:sup>
-                                        </m:sSup>
+                                              <m:sup>
+                                                <m:r>
+                                                  <w:rPr>
+                                                    <w:rFonts w:ascii="Cambria Math" w:eastAsiaTheme="minorEastAsia" w:hAnsi="Cambria Math" w:cs="Times New Roman"/>
+                                                    <w:sz w:val="24"/>
+                                                    <w:szCs w:val="24"/>
+                                                    <w:lang w:val="id-ID"/>
+                                                  </w:rPr>
+                                                  <m:t>k</m:t>
+                                                </m:r>
+                                              </m:sup>
+                                            </m:sSup>
+                                          </m:e>
+                                        </m:nary>
                                       </m:e>
                                     </m:d>
                                   </m:e>
@@ -4664,164 +4643,135 @@
                               <m:dPr>
                                 <m:ctrlPr>
                                   <w:rPr>
-                                    <w:rFonts w:ascii="Cambria Math" w:hAnsi="Cambria Math"/>
+                                    <w:rFonts w:ascii="Cambria Math" w:eastAsiaTheme="minorEastAsia" w:hAnsi="Cambria Math" w:cs="Times New Roman"/>
                                     <w:i/>
+                                    <w:sz w:val="24"/>
+                                    <w:szCs w:val="24"/>
                                   </w:rPr>
                                 </m:ctrlPr>
                               </m:dPr>
                               <m:e>
-                                <m:sSup>
-                                  <m:sSupPr>
+                                <m:nary>
+                                  <m:naryPr>
+                                    <m:chr m:val="∑"/>
+                                    <m:limLoc m:val="undOvr"/>
                                     <m:ctrlPr>
                                       <w:rPr>
-                                        <w:rFonts w:ascii="Cambria Math" w:hAnsi="Cambria Math"/>
+                                        <w:rFonts w:ascii="Cambria Math" w:eastAsiaTheme="minorEastAsia" w:hAnsi="Cambria Math" w:cs="Times New Roman"/>
                                         <w:i/>
+                                        <w:sz w:val="24"/>
+                                        <w:szCs w:val="24"/>
                                       </w:rPr>
                                     </m:ctrlPr>
-                                  </m:sSupPr>
-                                  <m:e>
-                                    <m:r>
-                                      <w:rPr>
-                                        <w:rFonts w:ascii="Cambria Math" w:hAnsi="Cambria Math"/>
-                                        <w:lang w:val="id-ID"/>
-                                      </w:rPr>
-                                      <m:t>x</m:t>
-                                    </m:r>
-                                  </m:e>
-                                  <m:sup>
-                                    <m:r>
-                                      <w:rPr>
-                                        <w:rFonts w:ascii="Cambria Math" w:hAnsi="Cambria Math"/>
-                                        <w:lang w:val="id-ID"/>
-                                      </w:rPr>
-                                      <m:t>n</m:t>
-                                    </m:r>
-                                  </m:sup>
-                                </m:sSup>
-                                <m:r>
-                                  <w:rPr>
-                                    <w:rFonts w:ascii="Cambria Math" w:hAnsi="Cambria Math"/>
-                                    <w:lang w:val="id-ID"/>
-                                  </w:rPr>
-                                  <m:t xml:space="preserve"> + </m:t>
-                                </m:r>
-                                <m:d>
-                                  <m:dPr>
-                                    <m:begChr m:val="{"/>
-                                    <m:endChr m:val="}"/>
-                                    <m:ctrlPr>
-                                      <w:rPr>
-                                        <w:rFonts w:ascii="Cambria Math" w:hAnsi="Cambria Math"/>
-                                        <w:i/>
-                                      </w:rPr>
-                                    </m:ctrlPr>
-                                  </m:dPr>
-                                  <m:e>
-                                    <m:r>
-                                      <w:rPr>
-                                        <w:rFonts w:ascii="Cambria Math" w:hAnsi="Cambria Math"/>
-                                        <w:lang w:val="id-ID"/>
-                                      </w:rPr>
-                                      <m:t>x × E × n</m:t>
-                                    </m:r>
-                                  </m:e>
-                                </m:d>
-                                <m:r>
-                                  <w:rPr>
-                                    <w:rFonts w:ascii="Cambria Math" w:hAnsi="Cambria Math"/>
-                                    <w:lang w:val="id-ID"/>
-                                  </w:rPr>
-                                  <m:t xml:space="preserve"> - </m:t>
-                                </m:r>
-                                <m:sSup>
-                                  <m:sSupPr>
-                                    <m:ctrlPr>
-                                      <w:rPr>
-                                        <w:rFonts w:ascii="Cambria Math" w:hAnsi="Cambria Math"/>
-                                        <w:i/>
-                                      </w:rPr>
-                                    </m:ctrlPr>
-                                  </m:sSupPr>
-                                  <m:e>
+                                  </m:naryPr>
+                                  <m:sub>
                                     <m:d>
                                       <m:dPr>
-                                        <m:begChr m:val="{"/>
-                                        <m:endChr m:val="}"/>
                                         <m:ctrlPr>
                                           <w:rPr>
-                                            <w:rFonts w:ascii="Cambria Math" w:hAnsi="Cambria Math"/>
+                                            <w:rFonts w:ascii="Cambria Math" w:eastAsiaTheme="minorEastAsia" w:hAnsi="Cambria Math" w:cs="Times New Roman"/>
                                             <w:i/>
+                                            <w:sz w:val="24"/>
+                                            <w:szCs w:val="24"/>
                                           </w:rPr>
                                         </m:ctrlPr>
                                       </m:dPr>
                                       <m:e>
                                         <m:r>
                                           <w:rPr>
-                                            <w:rFonts w:ascii="Cambria Math" w:hAnsi="Cambria Math"/>
+                                            <w:rFonts w:ascii="Cambria Math" w:eastAsiaTheme="minorEastAsia" w:hAnsi="Cambria Math" w:cs="Times New Roman"/>
+                                            <w:sz w:val="24"/>
+                                            <w:szCs w:val="24"/>
                                             <w:lang w:val="id-ID"/>
                                           </w:rPr>
-                                          <m:t>E × x</m:t>
+                                          <m:t>i=k</m:t>
                                         </m:r>
                                       </m:e>
                                     </m:d>
-                                  </m:e>
+                                  </m:sub>
                                   <m:sup>
+                                    <m:r>
+                                      <w:rPr>
+                                        <w:rFonts w:ascii="Cambria Math" w:eastAsiaTheme="minorEastAsia" w:hAnsi="Cambria Math" w:cs="Times New Roman"/>
+                                        <w:sz w:val="24"/>
+                                        <w:szCs w:val="24"/>
+                                        <w:lang w:val="id-ID"/>
+                                      </w:rPr>
+                                      <m:t>n</m:t>
+                                    </m:r>
+                                  </m:sup>
+                                  <m:e>
                                     <m:d>
                                       <m:dPr>
                                         <m:ctrlPr>
                                           <w:rPr>
-                                            <w:rFonts w:ascii="Cambria Math" w:hAnsi="Cambria Math"/>
+                                            <w:rFonts w:ascii="Cambria Math" w:eastAsiaTheme="minorEastAsia" w:hAnsi="Cambria Math" w:cs="Times New Roman"/>
                                             <w:i/>
+                                            <w:sz w:val="24"/>
+                                            <w:szCs w:val="24"/>
                                           </w:rPr>
                                         </m:ctrlPr>
                                       </m:dPr>
                                       <m:e>
-                                        <m:r>
-                                          <w:rPr>
-                                            <w:rFonts w:ascii="Cambria Math" w:hAnsi="Cambria Math"/>
-                                            <w:lang w:val="id-ID"/>
-                                          </w:rPr>
-                                          <m:t>n - 1</m:t>
-                                        </m:r>
+                                        <m:m>
+                                          <m:mPr>
+                                            <m:mcs>
+                                              <m:mc>
+                                                <m:mcPr>
+                                                  <m:count m:val="1"/>
+                                                  <m:mcJc m:val="center"/>
+                                                </m:mcPr>
+                                              </m:mc>
+                                            </m:mcs>
+                                            <m:ctrlPr>
+                                              <w:rPr>
+                                                <w:rFonts w:ascii="Cambria Math" w:eastAsiaTheme="minorEastAsia" w:hAnsi="Cambria Math" w:cs="Times New Roman"/>
+                                                <w:i/>
+                                                <w:sz w:val="24"/>
+                                                <w:szCs w:val="24"/>
+                                              </w:rPr>
+                                            </m:ctrlPr>
+                                          </m:mPr>
+                                          <m:mr>
+                                            <m:e>
+                                              <m:r>
+                                                <w:rPr>
+                                                  <w:rFonts w:ascii="Cambria Math" w:eastAsiaTheme="minorEastAsia" w:hAnsi="Cambria Math" w:cs="Times New Roman"/>
+                                                  <w:sz w:val="24"/>
+                                                  <w:szCs w:val="24"/>
+                                                  <w:lang w:val="id-ID"/>
+                                                </w:rPr>
+                                                <m:t>n</m:t>
+                                              </m:r>
+                                            </m:e>
+                                          </m:mr>
+                                          <m:mr>
+                                            <m:e>
+                                              <m:r>
+                                                <w:rPr>
+                                                  <w:rFonts w:ascii="Cambria Math" w:eastAsiaTheme="minorEastAsia" w:hAnsi="Cambria Math" w:cs="Times New Roman"/>
+                                                  <w:sz w:val="24"/>
+                                                  <w:szCs w:val="24"/>
+                                                  <w:lang w:val="id-ID"/>
+                                                </w:rPr>
+                                                <m:t>i</m:t>
+                                              </m:r>
+                                            </m:e>
+                                          </m:mr>
+                                        </m:m>
                                       </m:e>
                                     </m:d>
-                                  </m:sup>
-                                </m:sSup>
-                                <m:r>
-                                  <w:rPr>
-                                    <w:rFonts w:ascii="Cambria Math" w:hAnsi="Cambria Math"/>
-                                    <w:lang w:val="id-ID"/>
-                                  </w:rPr>
-                                  <m:t xml:space="preserve"> + </m:t>
-                                </m:r>
-                                <m:sSup>
-                                  <m:sSupPr>
-                                    <m:ctrlPr>
-                                      <w:rPr>
-                                        <w:rFonts w:ascii="Cambria Math" w:hAnsi="Cambria Math"/>
-                                        <w:i/>
-                                      </w:rPr>
-                                    </m:ctrlPr>
-                                  </m:sSupPr>
-                                  <m:e>
-                                    <m:r>
-                                      <w:rPr>
-                                        <w:rFonts w:ascii="Cambria Math" w:hAnsi="Cambria Math"/>
-                                        <w:lang w:val="id-ID"/>
-                                      </w:rPr>
-                                      <m:t>E</m:t>
-                                    </m:r>
-                                  </m:e>
-                                  <m:sup>
-                                    <m:d>
-                                      <m:dPr>
+                                    <m:sSup>
+                                      <m:sSupPr>
                                         <m:ctrlPr>
                                           <w:rPr>
-                                            <w:rFonts w:ascii="Cambria Math" w:hAnsi="Cambria Math"/>
+                                            <w:rFonts w:ascii="Cambria Math" w:eastAsiaTheme="minorEastAsia" w:hAnsi="Cambria Math" w:cs="Times New Roman"/>
                                             <w:i/>
+                                            <w:sz w:val="24"/>
+                                            <w:szCs w:val="24"/>
                                           </w:rPr>
                                         </m:ctrlPr>
-                                      </m:dPr>
+                                      </m:sSupPr>
                                       <m:e>
                                         <m:d>
                                           <m:dPr>
@@ -4836,23 +4786,83 @@
                                             <m:r>
                                               <w:rPr>
                                                 <w:rFonts w:ascii="Cambria Math" w:hAnsi="Cambria Math"/>
-                                                <w:lang w:val="id-ID"/>
                                               </w:rPr>
-                                              <m:t>2 × n</m:t>
+                                              <m:t>E + x</m:t>
                                             </m:r>
                                           </m:e>
                                         </m:d>
+                                      </m:e>
+                                      <m:sup>
+                                        <m:d>
+                                          <m:dPr>
+                                            <m:ctrlPr>
+                                              <w:rPr>
+                                                <w:rFonts w:ascii="Cambria Math" w:eastAsiaTheme="minorEastAsia" w:hAnsi="Cambria Math" w:cs="Times New Roman"/>
+                                                <w:i/>
+                                                <w:sz w:val="24"/>
+                                                <w:szCs w:val="24"/>
+                                              </w:rPr>
+                                            </m:ctrlPr>
+                                          </m:dPr>
+                                          <m:e>
+                                            <m:r>
+                                              <w:rPr>
+                                                <w:rFonts w:ascii="Cambria Math" w:eastAsiaTheme="minorEastAsia" w:hAnsi="Cambria Math" w:cs="Times New Roman"/>
+                                                <w:sz w:val="24"/>
+                                                <w:szCs w:val="24"/>
+                                                <w:lang w:val="id-ID"/>
+                                              </w:rPr>
+                                              <m:t>k - n</m:t>
+                                            </m:r>
+                                          </m:e>
+                                        </m:d>
+                                      </m:sup>
+                                    </m:sSup>
+                                    <m:r>
+                                      <w:rPr>
+                                        <w:rFonts w:ascii="Cambria Math" w:eastAsiaTheme="minorEastAsia" w:hAnsi="Cambria Math" w:cs="Times New Roman"/>
+                                        <w:sz w:val="24"/>
+                                        <w:szCs w:val="24"/>
+                                        <w:lang w:val="id-ID"/>
+                                      </w:rPr>
+                                      <m:t xml:space="preserve"> </m:t>
+                                    </m:r>
+                                    <m:sSup>
+                                      <m:sSupPr>
+                                        <m:ctrlPr>
+                                          <w:rPr>
+                                            <w:rFonts w:ascii="Cambria Math" w:eastAsiaTheme="minorEastAsia" w:hAnsi="Cambria Math" w:cs="Times New Roman"/>
+                                            <w:i/>
+                                            <w:sz w:val="24"/>
+                                            <w:szCs w:val="24"/>
+                                          </w:rPr>
+                                        </m:ctrlPr>
+                                      </m:sSupPr>
+                                      <m:e>
                                         <m:r>
                                           <w:rPr>
-                                            <w:rFonts w:ascii="Cambria Math" w:hAnsi="Cambria Math"/>
+                                            <w:rFonts w:ascii="Cambria Math" w:eastAsiaTheme="minorEastAsia" w:hAnsi="Cambria Math" w:cs="Times New Roman"/>
+                                            <w:sz w:val="24"/>
+                                            <w:szCs w:val="24"/>
                                             <w:lang w:val="id-ID"/>
                                           </w:rPr>
-                                          <m:t xml:space="preserve"> - 1</m:t>
+                                          <m:t>E</m:t>
                                         </m:r>
                                       </m:e>
-                                    </m:d>
-                                  </m:sup>
-                                </m:sSup>
+                                      <m:sup>
+                                        <m:r>
+                                          <w:rPr>
+                                            <w:rFonts w:ascii="Cambria Math" w:eastAsiaTheme="minorEastAsia" w:hAnsi="Cambria Math" w:cs="Times New Roman"/>
+                                            <w:sz w:val="24"/>
+                                            <w:szCs w:val="24"/>
+                                            <w:lang w:val="id-ID"/>
+                                          </w:rPr>
+                                          <m:t>k</m:t>
+                                        </m:r>
+                                      </m:sup>
+                                    </m:sSup>
+                                  </m:e>
+                                </m:nary>
                               </m:e>
                             </m:d>
                           </m:e>

</xml_diff>